<commit_message>
Add test conditions section and full sync of retest protocol (17/18 done)
Added a critical "Условия проведения" section capturing model (OpenAI/gpt-5.5), agent mode, reasoning-off setting, and search scope (Данные+Документы, narrowed to the ЭКО collection) from the live UI screenshot -- flagged as an open question whether these matched the original 11.09 pilot's conditions, since a mismatch could explain some of the observed changes independent of any corpus/parser fix.

Rewrote the .md wholesale to stay in sync with the .docx after many incremental edits. Current tally at 17/18 retested: 3 fixed (1.2, 1.3, 5.1), 1 partially improved (3.2), 1 regression (2.1), 3 unchanged-still-broken (2.2, 2.3, 5.2 -- the last confirming the retrieval root-cause-2 hypothesis), 7 unchanged-correct, 1 remaining (6.3; 6.2 also still pending in the sheet).

Co-Authored-By: Claude Sonnet 5 <noreply@anthropic.com>
Claude-Session: https://claude.ai/code/session_01DpSN8JwCJ3tg3JVUadr2zE
</commit_message>
<xml_diff>
--- a/docs/accounts/eco/pilot-test-02-retest-protocol.docx
+++ b/docs/accounts/eco/pilot-test-02-retest-protocol.docx
@@ -44,6 +44,260 @@
       </w:r>
     </w:p>
     <w:p>
+      <w:r>
+        <w:rPr>
+          <w:b/>
+        </w:rPr>
+        <w:t xml:space="preserve">Статус документа: </w:t>
+      </w:r>
+      <w:r>
+        <w:t>снимок состояния «как есть» на дату/время каждой записи (не финальный вывод). План: зафиксировать текущее состояние по всем 18 вопросам → почистить/перезалить корпус → повторный тест с отдельным протоколом (pilot-test-03).</w:t>
+      </w:r>
+    </w:p>
+    <w:p>
+      <w:pPr>
+        <w:pStyle w:val="Heading2"/>
+      </w:pPr>
+      <w:r>
+        <w:t>Условия проведения ре-теста (важно для воспроизводимости)</w:t>
+      </w:r>
+    </w:p>
+    <w:p>
+      <w:r>
+        <w:t>Зафиксировано по скриншоту интерфейса платформы на 12.09.2026, 13:44-13:46:</w:t>
+      </w:r>
+    </w:p>
+    <w:tbl>
+      <w:tblPr>
+        <w:tblStyle w:val="TableGrid"/>
+        <w:tblW w:type="auto" w:w="0"/>
+        <w:tblLook w:firstColumn="1" w:firstRow="1" w:lastColumn="0" w:lastRow="0" w:noHBand="0" w:noVBand="1" w:val="04A0"/>
+      </w:tblPr>
+      <w:tblGrid>
+        <w:gridCol w:w="4320"/>
+        <w:gridCol w:w="4320"/>
+      </w:tblGrid>
+      <w:tr>
+        <w:tc>
+          <w:tcPr>
+            <w:tcW w:type="dxa" w:w="4320"/>
+            <w:shd w:val="clear" w:color="auto" w:fill="1F4E78"/>
+          </w:tcPr>
+          <w:p>
+            <w:r>
+              <w:rPr>
+                <w:b/>
+                <w:color w:val="FFFFFF"/>
+                <w:sz w:val="18"/>
+              </w:rPr>
+              <w:t>Параметр</w:t>
+            </w:r>
+          </w:p>
+        </w:tc>
+        <w:tc>
+          <w:tcPr>
+            <w:tcW w:type="dxa" w:w="4320"/>
+            <w:shd w:val="clear" w:color="auto" w:fill="1F4E78"/>
+          </w:tcPr>
+          <w:p>
+            <w:r>
+              <w:rPr>
+                <w:b/>
+                <w:color w:val="FFFFFF"/>
+                <w:sz w:val="18"/>
+              </w:rPr>
+              <w:t>Значение</w:t>
+            </w:r>
+          </w:p>
+        </w:tc>
+      </w:tr>
+      <w:tr>
+        <w:tc>
+          <w:tcPr>
+            <w:tcW w:type="dxa" w:w="4320"/>
+          </w:tcPr>
+          <w:p>
+            <w:r>
+              <w:rPr>
+                <w:sz w:val="18"/>
+              </w:rPr>
+              <w:t>Модель</w:t>
+            </w:r>
+          </w:p>
+        </w:tc>
+        <w:tc>
+          <w:tcPr>
+            <w:tcW w:type="dxa" w:w="4320"/>
+          </w:tcPr>
+          <w:p>
+            <w:r>
+              <w:rPr>
+                <w:sz w:val="18"/>
+              </w:rPr>
+              <w:t>OpenAI/gpt-5.5</w:t>
+            </w:r>
+          </w:p>
+        </w:tc>
+      </w:tr>
+      <w:tr>
+        <w:tc>
+          <w:tcPr>
+            <w:tcW w:type="dxa" w:w="4320"/>
+          </w:tcPr>
+          <w:p>
+            <w:r>
+              <w:rPr>
+                <w:sz w:val="18"/>
+              </w:rPr>
+              <w:t>Агент/режим</w:t>
+            </w:r>
+          </w:p>
+        </w:tc>
+        <w:tc>
+          <w:tcPr>
+            <w:tcW w:type="dxa" w:w="4320"/>
+          </w:tcPr>
+          <w:p>
+            <w:r>
+              <w:rPr>
+                <w:sz w:val="18"/>
+              </w:rPr>
+              <w:t>«Синапс.Инсайт — Ана...» (название обрезано в интерфейсе на скриншоте, точное полное название не подтверждено) + переключатель «АГЕНТ» включён</w:t>
+            </w:r>
+          </w:p>
+        </w:tc>
+      </w:tr>
+      <w:tr>
+        <w:tc>
+          <w:tcPr>
+            <w:tcW w:type="dxa" w:w="4320"/>
+          </w:tcPr>
+          <w:p>
+            <w:r>
+              <w:rPr>
+                <w:sz w:val="18"/>
+              </w:rPr>
+              <w:t>Рассуждения (reasoning)</w:t>
+            </w:r>
+          </w:p>
+        </w:tc>
+        <w:tc>
+          <w:tcPr>
+            <w:tcW w:type="dxa" w:w="4320"/>
+          </w:tcPr>
+          <w:p>
+            <w:r>
+              <w:rPr>
+                <w:sz w:val="18"/>
+              </w:rPr>
+              <w:t>Выключены («Рассуждения ВЫКЛ»)</w:t>
+            </w:r>
+          </w:p>
+        </w:tc>
+      </w:tr>
+      <w:tr>
+        <w:tc>
+          <w:tcPr>
+            <w:tcW w:type="dxa" w:w="4320"/>
+          </w:tcPr>
+          <w:p>
+            <w:r>
+              <w:rPr>
+                <w:sz w:val="18"/>
+              </w:rPr>
+              <w:t>Область поиска — источники</w:t>
+            </w:r>
+          </w:p>
+        </w:tc>
+        <w:tc>
+          <w:tcPr>
+            <w:tcW w:type="dxa" w:w="4320"/>
+          </w:tcPr>
+          <w:p>
+            <w:r>
+              <w:rPr>
+                <w:sz w:val="18"/>
+              </w:rPr>
+              <w:t>[x] «Данные (каталог и SQL)», [x] «Документы», [ ] «Интернет» (отмечен как «ВНЕШНИЙ», не использовался)</w:t>
+            </w:r>
+          </w:p>
+        </w:tc>
+      </w:tr>
+      <w:tr>
+        <w:tc>
+          <w:tcPr>
+            <w:tcW w:type="dxa" w:w="4320"/>
+          </w:tcPr>
+          <w:p>
+            <w:r>
+              <w:rPr>
+                <w:sz w:val="18"/>
+              </w:rPr>
+              <w:t>Область поиска — коллекции</w:t>
+            </w:r>
+          </w:p>
+        </w:tc>
+        <w:tc>
+          <w:tcPr>
+            <w:tcW w:type="dxa" w:w="4320"/>
+          </w:tcPr>
+          <w:p>
+            <w:r>
+              <w:rPr>
+                <w:sz w:val="18"/>
+              </w:rPr>
+              <w:t>только «ЭКО» — сужено до 1 коллекции («Данные и документы · сужено: 1»)</w:t>
+            </w:r>
+          </w:p>
+        </w:tc>
+      </w:tr>
+      <w:tr>
+        <w:tc>
+          <w:tcPr>
+            <w:tcW w:type="dxa" w:w="4320"/>
+          </w:tcPr>
+          <w:p>
+            <w:r>
+              <w:rPr>
+                <w:sz w:val="18"/>
+              </w:rPr>
+              <w:t>Периметр</w:t>
+            </w:r>
+          </w:p>
+        </w:tc>
+        <w:tc>
+          <w:tcPr>
+            <w:tcW w:type="dxa" w:w="4320"/>
+          </w:tcPr>
+          <w:p>
+            <w:r>
+              <w:rPr>
+                <w:sz w:val="18"/>
+              </w:rPr>
+              <w:t>Бейдж «защищённый контур — данные не покидают компании»</w:t>
+            </w:r>
+          </w:p>
+        </w:tc>
+      </w:tr>
+    </w:tbl>
+    <w:p/>
+    <w:p>
+      <w:r>
+        <w:rPr>
+          <w:b/>
+        </w:rPr>
+        <w:t xml:space="preserve">Почему это важно: </w:t>
+      </w:r>
+      <w:r>
+        <w:t>ни исходный пилот от 11.09, ни этот ре-тест не документировали эти параметры явно до сих пор — если модель, режим агента или область поиска отличались между 11.09 и 12.09, часть найденных изменений («исправлено»/«регрессия»/«без изменений») может объясняться разницей в условиях запуска, а не изменениями в самом корпусе документов или парсере. Нужно уточнить у заказчика, были ли эти параметры идентичны 11.09 и 12.09 — без этого сравнение «было/стало» справедливо только при допущении, что условия не менялись.</w:t>
+      </w:r>
+    </w:p>
+    <w:p>
+      <w:r>
+        <w:t>Отдельно значимо, что область поиска включает «Данные (каталог и SQL)», а не только «Документы» — это значит, что задействован не только RAG-механизм (домены/коллекции), но потенциально и структурный SQL-слой (если у «Эко» есть такие источники — см. открытый вопрос в access-audit.md). Стоит уточнить, влияет ли эта настройка на данный конкретный тест (все вопросы пилота — про регламенты, не про табличные данные) или это просто общая настройка агента по умолчанию.</w:t>
+      </w:r>
+    </w:p>
+    <w:p>
       <w:pPr>
         <w:pStyle w:val="Heading2"/>
       </w:pPr>
@@ -58,7 +312,7 @@
     </w:p>
     <w:p>
       <w:r>
-        <w:t>12.09.2026 пользователь начал повторно задавать те же вопросы в чате платформы. Настоящий протокол фиксирует то, что уже подтверждено скриншотами живого чата на этот момент: 2 из 7 ошибок пилота исправлены, 1 из 7 без изменений, и параллельно обнаружена 1 регрессия на вопросе, который в исходном пилоте отвечался верно. Картина смешанная, не однозначно позитивная. Остальные 13 вопросов на момент составления протокола ещё не перепроверены.</w:t>
+        <w:t>12.09.2026 пользователь начал повторно задавать те же вопросы в чате платформы. Настоящий протокол фиксирует то, что уже подтверждено скриншотами живого чата на этот момент: 2 из 7 ошибок пилота исправлены, 2 из 7 без изменений (плюс частичное улучшение по третьей), и параллельно обнаружена 1 регрессия на вопросе, который в исходном пилоте отвечался верно. Картина смешанная, не однозначно позитивная. По состоянию на текущую версию протокола перепроверены 17 из 18 вопросов.</w:t>
       </w:r>
     </w:p>
     <w:p>
@@ -214,7 +468,7 @@
               <w:rPr>
                 <w:sz w:val="18"/>
               </w:rPr>
-              <w:t>Отвечено верно: «Экспериментальной выработкой руководит технолог лаборатории: он управляет производственным процессом и при необходимости вносит корректировки в технологию с отражением их в РИ (Форма 16-03). После завершения процесса образец передают в ОКК; при отклонении качества продукт дорабатывается под руководством технолога лаборатории.»</w:t>
+              <w:t>Отвечено верно: «Экспериментальной выработкой руководит технолог лаборатории...»</w:t>
             </w:r>
           </w:p>
         </w:tc>
@@ -282,7 +536,7 @@
               <w:rPr>
                 <w:sz w:val="18"/>
               </w:rPr>
-              <w:t>Отвечено верно: «При пометке «Экспериментальная» выполняйте выработку по указаниям технолога лаборатории — он руководит экспериментальным производственным процессом и при необходимости корректирует технологию. Самостоятельно менять технологию не следует; изменения должны быть отражены в РИ (Форма 16-03). После завершения образец передают в ОКК.»</w:t>
+              <w:t>Отвечено верно: «При пометке «Экспериментальная» выполняйте выработку по указаниям технолога лаборатории...»</w:t>
             </w:r>
           </w:p>
         </w:tc>
@@ -300,6 +554,74 @@
           </w:p>
         </w:tc>
       </w:tr>
+      <w:tr>
+        <w:tc>
+          <w:tcPr>
+            <w:tcW w:type="dxa" w:w="1728"/>
+          </w:tcPr>
+          <w:p>
+            <w:r>
+              <w:rPr>
+                <w:sz w:val="18"/>
+              </w:rPr>
+              <w:t>5.1</w:t>
+            </w:r>
+          </w:p>
+        </w:tc>
+        <w:tc>
+          <w:tcPr>
+            <w:tcW w:type="dxa" w:w="1728"/>
+          </w:tcPr>
+          <w:p>
+            <w:r>
+              <w:rPr>
+                <w:sz w:val="18"/>
+              </w:rPr>
+              <w:t>Я технолог производства. Сырьё на складе «Проверка ОКК». Как получить?</w:t>
+            </w:r>
+          </w:p>
+        </w:tc>
+        <w:tc>
+          <w:tcPr>
+            <w:tcW w:type="dxa" w:w="1728"/>
+          </w:tcPr>
+          <w:p>
+            <w:r>
+              <w:rPr>
+                <w:sz w:val="18"/>
+              </w:rPr>
+              <w:t>«Частичный ответ» — «прямого порядка... нет» (был открытым вопросом, не в числе 7 ошибок)</w:t>
+            </w:r>
+          </w:p>
+        </w:tc>
+        <w:tc>
+          <w:tcPr>
+            <w:tcW w:type="dxa" w:w="1728"/>
+            <w:shd w:val="clear" w:color="auto" w:fill="C6EFCE"/>
+          </w:tcPr>
+          <w:p>
+            <w:r>
+              <w:rPr>
+                <w:sz w:val="18"/>
+              </w:rPr>
+              <w:t>Полный пошаговый ответ (5 шагов) именно для склада «Проверка ОКК»</w:t>
+            </w:r>
+          </w:p>
+        </w:tc>
+        <w:tc>
+          <w:tcPr>
+            <w:tcW w:type="dxa" w:w="1728"/>
+          </w:tcPr>
+          <w:p>
+            <w:r>
+              <w:rPr>
+                <w:sz w:val="18"/>
+              </w:rPr>
+              <w:t>ПР-09-00-14.doc — 49%; ПР-03-00-12.doc — 65%</w:t>
+            </w:r>
+          </w:p>
+        </w:tc>
+      </w:tr>
     </w:tbl>
     <w:p/>
     <w:p>
@@ -312,7 +634,178 @@
         <w:pStyle w:val="Heading2"/>
       </w:pPr>
       <w:r>
-        <w:t>3. Регрессия — вопрос, который раньше отвечался верно, а теперь нет</w:t>
+        <w:t>3. Частично улучшено</w:t>
+      </w:r>
+    </w:p>
+    <w:tbl>
+      <w:tblPr>
+        <w:tblStyle w:val="TableGrid"/>
+        <w:tblW w:type="auto" w:w="0"/>
+        <w:tblLook w:firstColumn="1" w:firstRow="1" w:lastColumn="0" w:lastRow="0" w:noHBand="0" w:noVBand="1" w:val="04A0"/>
+      </w:tblPr>
+      <w:tblGrid>
+        <w:gridCol w:w="1728"/>
+        <w:gridCol w:w="1728"/>
+        <w:gridCol w:w="1728"/>
+        <w:gridCol w:w="1728"/>
+        <w:gridCol w:w="1728"/>
+      </w:tblGrid>
+      <w:tr>
+        <w:tc>
+          <w:tcPr>
+            <w:tcW w:type="dxa" w:w="1728"/>
+            <w:shd w:val="clear" w:color="auto" w:fill="1F4E78"/>
+          </w:tcPr>
+          <w:p>
+            <w:r>
+              <w:rPr>
+                <w:b/>
+                <w:color w:val="FFFFFF"/>
+                <w:sz w:val="18"/>
+              </w:rPr>
+              <w:t>№</w:t>
+            </w:r>
+          </w:p>
+        </w:tc>
+        <w:tc>
+          <w:tcPr>
+            <w:tcW w:type="dxa" w:w="1728"/>
+            <w:shd w:val="clear" w:color="auto" w:fill="1F4E78"/>
+          </w:tcPr>
+          <w:p>
+            <w:r>
+              <w:rPr>
+                <w:b/>
+                <w:color w:val="FFFFFF"/>
+                <w:sz w:val="18"/>
+              </w:rPr>
+              <w:t>Вопрос</w:t>
+            </w:r>
+          </w:p>
+        </w:tc>
+        <w:tc>
+          <w:tcPr>
+            <w:tcW w:type="dxa" w:w="1728"/>
+            <w:shd w:val="clear" w:color="auto" w:fill="1F4E78"/>
+          </w:tcPr>
+          <w:p>
+            <w:r>
+              <w:rPr>
+                <w:b/>
+                <w:color w:val="FFFFFF"/>
+                <w:sz w:val="18"/>
+              </w:rPr>
+              <w:t>Было (11.09)</w:t>
+            </w:r>
+          </w:p>
+        </w:tc>
+        <w:tc>
+          <w:tcPr>
+            <w:tcW w:type="dxa" w:w="1728"/>
+            <w:shd w:val="clear" w:color="auto" w:fill="1F4E78"/>
+          </w:tcPr>
+          <w:p>
+            <w:r>
+              <w:rPr>
+                <w:b/>
+                <w:color w:val="FFFFFF"/>
+                <w:sz w:val="18"/>
+              </w:rPr>
+              <w:t>Стало (12.09)</w:t>
+            </w:r>
+          </w:p>
+        </w:tc>
+        <w:tc>
+          <w:tcPr>
+            <w:tcW w:type="dxa" w:w="1728"/>
+            <w:shd w:val="clear" w:color="auto" w:fill="1F4E78"/>
+          </w:tcPr>
+          <w:p>
+            <w:r>
+              <w:rPr>
+                <w:b/>
+                <w:color w:val="FFFFFF"/>
+                <w:sz w:val="18"/>
+              </w:rPr>
+              <w:t>Источник при ре-тесте</w:t>
+            </w:r>
+          </w:p>
+        </w:tc>
+      </w:tr>
+      <w:tr>
+        <w:tc>
+          <w:tcPr>
+            <w:tcW w:type="dxa" w:w="1728"/>
+          </w:tcPr>
+          <w:p>
+            <w:r>
+              <w:rPr>
+                <w:sz w:val="18"/>
+              </w:rPr>
+              <w:t>3.2</w:t>
+            </w:r>
+          </w:p>
+        </w:tc>
+        <w:tc>
+          <w:tcPr>
+            <w:tcW w:type="dxa" w:w="1728"/>
+          </w:tcPr>
+          <w:p>
+            <w:r>
+              <w:rPr>
+                <w:sz w:val="18"/>
+              </w:rPr>
+              <w:t>Клиент попросил поменять характеристику товара, заявка на сборку уже распечатана</w:t>
+            </w:r>
+          </w:p>
+        </w:tc>
+        <w:tc>
+          <w:tcPr>
+            <w:tcW w:type="dxa" w:w="1728"/>
+          </w:tcPr>
+          <w:p>
+            <w:r>
+              <w:rPr>
+                <w:sz w:val="18"/>
+              </w:rPr>
+              <w:t>«Частичный ответ» — что делать с распечатанной заявкой не описано; источник И-12-10-03 числился «не загружен»</w:t>
+            </w:r>
+          </w:p>
+        </w:tc>
+        <w:tc>
+          <w:tcPr>
+            <w:tcW w:type="dxa" w:w="1728"/>
+          </w:tcPr>
+          <w:p>
+            <w:r>
+              <w:rPr>
+                <w:sz w:val="18"/>
+              </w:rPr>
+              <w:t>Источник теперь подключён, появился шаг про распечатанную заявку, но точная инструкция «перепровести Заявку на комплектацию» из разбора ошибок всё ещё не дана</w:t>
+            </w:r>
+          </w:p>
+        </w:tc>
+        <w:tc>
+          <w:tcPr>
+            <w:tcW w:type="dxa" w:w="1728"/>
+          </w:tcPr>
+          <w:p>
+            <w:r>
+              <w:rPr>
+                <w:sz w:val="18"/>
+              </w:rPr>
+              <w:t>И-12-10-03.docx — 64%</w:t>
+            </w:r>
+          </w:p>
+        </w:tc>
+      </w:tr>
+    </w:tbl>
+    <w:p>
+      <w:pPr>
+        <w:pStyle w:val="Heading2"/>
+      </w:pPr>
+      <w:r>
+        <w:t>4. Регрессия — вопрос, который раньше отвечался верно, а теперь нет</w:t>
       </w:r>
     </w:p>
     <w:tbl>
@@ -446,7 +939,7 @@
               <w:rPr>
                 <w:sz w:val="18"/>
               </w:rPr>
-              <w:t>Чёткий ответ: «После фасовки оператор ПО заполняет в «Рабочей инструкции на производство» (форма 16-03): «Кол-во тарных мест», «Общее количество», «Дата», «Фасовщик ФИО подпись».»</w:t>
+              <w:t>Чёткий ответ: «...«Кол-во тарных мест», «Общее количество», «Дата», «Фасовщик ФИО подпись».»</w:t>
             </w:r>
           </w:p>
         </w:tc>
@@ -460,7 +953,7 @@
               <w:rPr>
                 <w:sz w:val="18"/>
               </w:rPr>
-              <w:t>Регрессия: «Какие именно поля оператор заполняет после фасовки, в найденном фрагменте не указано.» Названы только поля, проверяемые ДО фасовки.</w:t>
+              <w:t>Регрессия: «Какие именно поля оператор заполняет после фасовки, в найденном фрагменте не указано.»</w:t>
             </w:r>
           </w:p>
         </w:tc>
@@ -473,7 +966,7 @@
               <w:rPr>
                 <w:sz w:val="18"/>
               </w:rPr>
-              <w:t>Текст ответа ссылается на И-08-02-10 и ПР-08-00-14, но карточка источника в чате показывает другой файл — Datafortest07.07.xlsx (64%), не входящий в известный корпус СМК</w:t>
+              <w:t>Текст ссылается на И-08-02-10 и ПР-08-00-14, но карточка показывает Datafortest07.07.xlsx (64%), не входящий в известный корпус СМК</w:t>
             </w:r>
           </w:p>
         </w:tc>
@@ -482,7 +975,7 @@
     <w:p/>
     <w:p>
       <w:r>
-        <w:t>Это не «ещё не перепроверено» — это ухудшение относительно исходного пилота: вопрос, который платформа раньше отвечала полностью и точно, сейчас отвечает хуже. Дополнительная тревожная деталь — расхождение между тем, что написано в тексте ответа («Источник: И-08-02-10..., раздел 3.1; ПР-08-00-14..., раздел 5.6»), и тем, что реально показано в карточке источника в интерфейсе чата («Datafortest07.07.xlsx», 64%). Это может означать, что изменения, которые чинят одни документы (1.2/1.3), где-то на стороне платформы задевают выдачу по другим — то есть требуется отдельная проверка не только «что починили», но и «что могло сломаться попутно».</w:t>
+        <w:t>Это не «ещё не перепроверено» — это ухудшение относительно исходного пилота. Дополнительная тревожная деталь — расхождение между тем, что написано в тексте ответа, и тем, что реально показано в карточке источника.</w:t>
       </w:r>
     </w:p>
     <w:p>
@@ -490,7 +983,7 @@
         <w:pStyle w:val="Heading2"/>
       </w:pPr>
       <w:r>
-        <w:t>4. Без изменений — ошибка, которая осталась ошибкой</w:t>
+        <w:t>5. Без изменений — ошибки, которые остались ошибками</w:t>
       </w:r>
     </w:p>
     <w:tbl>
@@ -611,7 +1104,7 @@
               <w:rPr>
                 <w:sz w:val="18"/>
               </w:rPr>
-              <w:t>Действия по корректировке Заказа на производство при выпуске продукции с меньшим весом</w:t>
+              <w:t>Корректировка Заказа на производство при меньшем весе</w:t>
             </w:r>
           </w:p>
         </w:tc>
@@ -624,7 +1117,7 @@
               <w:rPr>
                 <w:sz w:val="18"/>
               </w:rPr>
-              <w:t>«Частичный ответ» — только общая процедура для Заказа покупателя, для Заказа на производство не найдено</w:t>
+              <w:t>«Частичный ответ» — только общая процедура для Заказа покупателя</w:t>
             </w:r>
           </w:p>
         </w:tc>
@@ -638,7 +1131,7 @@
               <w:rPr>
                 <w:sz w:val="18"/>
               </w:rPr>
-              <w:t>Без изменений: тот же общий ответ («откройте Заказ и создайте корректировку... если уже есть Заказ на производство — обратитесь к ОБ»). Конкретная процедура по-прежнему не дана</w:t>
+              <w:t>Без изменений: тот же общий ответ. Конкретная процедура (Д-08-04-01, п. 3.5.1-3.5.5) по-прежнему не дана</w:t>
             </w:r>
           </w:p>
         </w:tc>
@@ -651,7 +1144,75 @@
               <w:rPr>
                 <w:sz w:val="18"/>
               </w:rPr>
-              <w:t>И-12-10-03 «Корректировка Заказу покупателя в 1С».docx — 72%. Д-08-04-01 (реальный источник с п. 3.5.1–3.5.5) по-прежнему не цитируется</w:t>
+              <w:t>И-12-10-03.docx — 72%. Д-08-04-01 по-прежнему не цитируется</w:t>
+            </w:r>
+          </w:p>
+        </w:tc>
+      </w:tr>
+      <w:tr>
+        <w:tc>
+          <w:tcPr>
+            <w:tcW w:type="dxa" w:w="1728"/>
+          </w:tcPr>
+          <w:p>
+            <w:r>
+              <w:rPr>
+                <w:sz w:val="18"/>
+              </w:rPr>
+              <w:t>2.3</w:t>
+            </w:r>
+          </w:p>
+        </w:tc>
+        <w:tc>
+          <w:tcPr>
+            <w:tcW w:type="dxa" w:w="1728"/>
+          </w:tcPr>
+          <w:p>
+            <w:r>
+              <w:rPr>
+                <w:sz w:val="18"/>
+              </w:rPr>
+              <w:t>Высота сброса тары 1,5-5 л</w:t>
+            </w:r>
+          </w:p>
+        </w:tc>
+        <w:tc>
+          <w:tcPr>
+            <w:tcW w:type="dxa" w:w="1728"/>
+          </w:tcPr>
+          <w:p>
+            <w:r>
+              <w:rPr>
+                <w:sz w:val="18"/>
+              </w:rPr>
+              <w:t>«Нет чёткого ответа» — высота не указана</w:t>
+            </w:r>
+          </w:p>
+        </w:tc>
+        <w:tc>
+          <w:tcPr>
+            <w:tcW w:type="dxa" w:w="1728"/>
+            <w:shd w:val="clear" w:color="auto" w:fill="FFF2CC"/>
+          </w:tcPr>
+          <w:p>
+            <w:r>
+              <w:rPr>
+                <w:sz w:val="18"/>
+              </w:rPr>
+              <w:t>Без изменений: высота (0,8 м) по-прежнему не дана</w:t>
+            </w:r>
+          </w:p>
+        </w:tc>
+        <w:tc>
+          <w:tcPr>
+            <w:tcW w:type="dxa" w:w="1728"/>
+          </w:tcPr>
+          <w:p>
+            <w:r>
+              <w:rPr>
+                <w:sz w:val="18"/>
+              </w:rPr>
+              <w:t>Текст называет Д-09-01-17, карточка показывает файл «глоссарий» (100%) — вторая аномалия цитирования подряд</w:t>
             </w:r>
           </w:p>
         </w:tc>
@@ -660,7 +1221,13 @@
     <w:p/>
     <w:p>
       <w:r>
-        <w:t>Отдельно любопытный факт, не связанный напрямую с самим ответом: источник И-12-10-03.docx — тот самый документ, который в исходном разборе пилота числился как «не загружен в корпус» (был нужен для другого вопроса, 3.2). Судя по этой цитате, он на платформе уже есть, просто вопрос 2.2 требует другого документа (Д-08-04-01), который пока не подтягивается. То есть корпус на платформе, по-видимому, шире, чем то, что было прислано нам для локального анализа — стоит иметь это в виду при финальной сверке.</w:t>
+        <w:rPr>
+          <w:b/>
+        </w:rPr>
+        <w:t xml:space="preserve">Паттерн аномалии цитирования (2.1 и 2.3). </w:t>
+      </w:r>
+      <w:r>
+        <w:t>Дважды подряд карточка источника в интерфейсе чата показывает файл, не совпадающий с тем, что назван в тексте ответа, оба раза с высоким процентом релевантности. Это не похоже на случайный шум ранжирования — скорее на путаницу в том, что именно система показывает как «источник» в UI против того, что реально использовала модель. Стоит проверить это перед чисткой/перезаливкой корпуса.</w:t>
       </w:r>
     </w:p>
     <w:p>
@@ -668,40 +1235,7 @@
         <w:pStyle w:val="Heading2"/>
       </w:pPr>
       <w:r>
-        <w:t>5. Что это подтверждает и что остаётся открытым</w:t>
-      </w:r>
-    </w:p>
-    <w:p>
-      <w:r>
-        <w:rPr>
-          <w:b/>
-        </w:rPr>
-        <w:t xml:space="preserve">Подтверждено. </w:t>
-      </w:r>
-      <w:r>
-        <w:t>Оба вопроса, которые чинятся сейчас, опирались на один и тот же документ — И-16-01-11.doc. Раньше этот файл не выдавал ничего (или выдавал не то, что нужно); теперь он цитируется напрямую, и текст ответа слово в слово совпадает с тем, что было независимо извлечено вручную через catdoc при разборе пилота («руководит производственным процессом на экспериментальной выработке»). Это сильный, предметный сигнал, что причина ошибок 1.2/1.3 была в одном конкретном файле, а не в чём-то более общем.</w:t>
-      </w:r>
-    </w:p>
-    <w:p>
-      <w:r>
-        <w:rPr>
-          <w:b/>
-        </w:rPr>
-        <w:t xml:space="preserve">Требует уточнения — важная деталь, которая не дана автоматически. </w:t>
-      </w:r>
-      <w:r>
-        <w:t>В обеих цитатах источник указан как И-16-01-11.doc, то есть с расширением .doc, а не .docx. Предложенное в анализе пилота действие («пересохранить .doc-корпус в .docx и перезалить») предполагало бы, что в цитате появится .docx. Раз этого не произошло, самое вероятное объяснение — документ переиндексировали на стороне платформы без смены формата файла. Нужно уточнить у команды, сопровождающей стенд, что именно было сделано между 11.09 и 12.09 — это определяет, что писать в выводах: подтверждена ли гипотеза «формат .doc как таковой» или подтверждена только более узкая «этот конкретный файл не был обработан», а причина могла быть другой. Случаи 2.1 (регрессия) и 2.2 (без изменений) показывают, что изменение не было равномерным «почини всё .doc сразу» — это точечная правка отдельных документов, а не системный фикс формата.</w:t>
-      </w:r>
-    </w:p>
-    <w:p>
-      <w:r>
-        <w:rPr>
-          <w:b/>
-        </w:rPr>
-        <w:t xml:space="preserve">Не перепроверено — 13 из 18 вопросов, </w:t>
-      </w:r>
-      <w:r>
-        <w:t>включая 4 оставшихся подтверждённых ошибки пилота:</w:t>
+        <w:t>6. Без изменений — верные ответы (не входили в число ошибок)</w:t>
       </w:r>
     </w:p>
     <w:tbl>
@@ -760,7 +1294,7 @@
                 <w:color w:val="FFFFFF"/>
                 <w:sz w:val="18"/>
               </w:rPr>
-              <w:t>Ожидаемый источник / статус</w:t>
+              <w:t>Комментарий</w:t>
             </w:r>
           </w:p>
         </w:tc>
@@ -775,7 +1309,7 @@
               <w:rPr>
                 <w:sz w:val="18"/>
               </w:rPr>
-              <w:t>2.3</w:t>
+              <w:t>3.1</w:t>
             </w:r>
           </w:p>
         </w:tc>
@@ -788,7 +1322,7 @@
               <w:rPr>
                 <w:sz w:val="18"/>
               </w:rPr>
-              <w:t>Высота сброса тары 1,5–5 л</w:t>
+              <w:t>Технолог ПО получает сырьё на производство</w:t>
             </w:r>
           </w:p>
         </w:tc>
@@ -801,7 +1335,7 @@
               <w:rPr>
                 <w:sz w:val="18"/>
               </w:rPr>
-              <w:t>Методика №38.doc — не перепроверено</w:t>
+              <w:t>Без изменений, верно, источники релевантны, аномалий нет</w:t>
             </w:r>
           </w:p>
         </w:tc>
@@ -816,7 +1350,7 @@
               <w:rPr>
                 <w:sz w:val="18"/>
               </w:rPr>
-              <w:t>3.2</w:t>
+              <w:t>3.3</w:t>
             </w:r>
           </w:p>
         </w:tc>
@@ -829,7 +1363,7 @@
               <w:rPr>
                 <w:sz w:val="18"/>
               </w:rPr>
-              <w:t>Смена характеристики товара в заказе с распечатанной заявкой</w:t>
+              <w:t>Продукцию забраковали — действия</w:t>
             </w:r>
           </w:p>
         </w:tc>
@@ -842,7 +1376,7 @@
               <w:rPr>
                 <w:sz w:val="18"/>
               </w:rPr>
-              <w:t>И-12-10-03 — на платформе, судя по §4, уже есть</w:t>
+              <w:t>Без изменений, верно, ответ даже детальнее (формы 03-01/03-03, конкретные роли)</w:t>
             </w:r>
           </w:p>
         </w:tc>
@@ -857,7 +1391,7 @@
               <w:rPr>
                 <w:sz w:val="18"/>
               </w:rPr>
-              <w:t>5.2</w:t>
+              <w:t>4.1</w:t>
             </w:r>
           </w:p>
         </w:tc>
@@ -870,7 +1404,7 @@
               <w:rPr>
                 <w:sz w:val="18"/>
               </w:rPr>
-              <w:t>Приоритет между заявками на ремонт</w:t>
+              <w:t>Марка стретч-плёнки</w:t>
             </w:r>
           </w:p>
         </w:tc>
@@ -883,7 +1417,7 @@
               <w:rPr>
                 <w:sz w:val="18"/>
               </w:rPr>
-              <w:t>ПР-10(02)-00.docx — retrieval-случай, не парсинг — не перепроверено</w:t>
+              <w:t>Без изменений — верное «не найдено» (детали физически нет в корпусе, подтверждено в pilot-test-01)</w:t>
             </w:r>
           </w:p>
         </w:tc>
@@ -898,7 +1432,7 @@
               <w:rPr>
                 <w:sz w:val="18"/>
               </w:rPr>
-              <w:t>6.2</w:t>
+              <w:t>4.2</w:t>
             </w:r>
           </w:p>
         </w:tc>
@@ -911,7 +1445,7 @@
               <w:rPr>
                 <w:sz w:val="18"/>
               </w:rPr>
-              <w:t>Добавление новой Спецификации в 1С-8</w:t>
+              <w:t>Периодичность оценки подрядчиков</w:t>
             </w:r>
           </w:p>
         </w:tc>
@@ -924,7 +1458,446 @@
               <w:rPr>
                 <w:sz w:val="18"/>
               </w:rPr>
-              <w:t>И-08-05-08.doc — не перепроверено</w:t>
+              <w:t>Без изменений — вопрос остаётся открытым, найдено смежное поле «Оценка результативности», но не сама периодичность</w:t>
+            </w:r>
+          </w:p>
+        </w:tc>
+      </w:tr>
+      <w:tr>
+        <w:tc>
+          <w:tcPr>
+            <w:tcW w:type="dxa" w:w="2880"/>
+          </w:tcPr>
+          <w:p>
+            <w:r>
+              <w:rPr>
+                <w:sz w:val="18"/>
+              </w:rPr>
+              <w:t>4.3</w:t>
+            </w:r>
+          </w:p>
+        </w:tc>
+        <w:tc>
+          <w:tcPr>
+            <w:tcW w:type="dxa" w:w="2880"/>
+          </w:tcPr>
+          <w:p>
+            <w:r>
+              <w:rPr>
+                <w:sz w:val="18"/>
+              </w:rPr>
+              <w:t>Поля Формы 17-08</w:t>
+            </w:r>
+          </w:p>
+        </w:tc>
+        <w:tc>
+          <w:tcPr>
+            <w:tcW w:type="dxa" w:w="2880"/>
+          </w:tcPr>
+          <w:p>
+            <w:r>
+              <w:rPr>
+                <w:sz w:val="18"/>
+              </w:rPr>
+              <w:t>Без изменений — верное «не найдено» (сама форма как бланк не в корпусе), источник цитирования сменился на другой файл</w:t>
+            </w:r>
+          </w:p>
+        </w:tc>
+      </w:tr>
+      <w:tr>
+        <w:tc>
+          <w:tcPr>
+            <w:tcW w:type="dxa" w:w="2880"/>
+          </w:tcPr>
+          <w:p>
+            <w:r>
+              <w:rPr>
+                <w:sz w:val="18"/>
+              </w:rPr>
+              <w:t>5.3</w:t>
+            </w:r>
+          </w:p>
+        </w:tc>
+        <w:tc>
+          <w:tcPr>
+            <w:tcW w:type="dxa" w:w="2880"/>
+          </w:tcPr>
+          <w:p>
+            <w:r>
+              <w:rPr>
+                <w:sz w:val="18"/>
+              </w:rPr>
+              <w:t>Запас продукции при занятом оборудовании</w:t>
+            </w:r>
+          </w:p>
+        </w:tc>
+        <w:tc>
+          <w:tcPr>
+            <w:tcW w:type="dxa" w:w="2880"/>
+          </w:tcPr>
+          <w:p>
+            <w:r>
+              <w:rPr>
+                <w:sz w:val="18"/>
+              </w:rPr>
+              <w:t>Без изменений, верно, ответ детальнее с постатейной сверкой источников</w:t>
+            </w:r>
+          </w:p>
+        </w:tc>
+      </w:tr>
+      <w:tr>
+        <w:tc>
+          <w:tcPr>
+            <w:tcW w:type="dxa" w:w="2880"/>
+          </w:tcPr>
+          <w:p>
+            <w:r>
+              <w:rPr>
+                <w:sz w:val="18"/>
+              </w:rPr>
+              <w:t>6.1</w:t>
+            </w:r>
+          </w:p>
+        </w:tc>
+        <w:tc>
+          <w:tcPr>
+            <w:tcW w:type="dxa" w:w="2880"/>
+          </w:tcPr>
+          <w:p>
+            <w:r>
+              <w:rPr>
+                <w:sz w:val="18"/>
+              </w:rPr>
+              <w:t>Действия оператора по фасовке</w:t>
+            </w:r>
+          </w:p>
+        </w:tc>
+        <w:tc>
+          <w:tcPr>
+            <w:tcW w:type="dxa" w:w="2880"/>
+          </w:tcPr>
+          <w:p>
+            <w:r>
+              <w:rPr>
+                <w:sz w:val="18"/>
+              </w:rPr>
+              <w:t>Без изменений, верно, ответ детальнее исходного</w:t>
+            </w:r>
+          </w:p>
+        </w:tc>
+      </w:tr>
+    </w:tbl>
+    <w:p>
+      <w:pPr>
+        <w:pStyle w:val="Heading2"/>
+      </w:pPr>
+      <w:r>
+        <w:t>7. Итоговая сводка на момент составления протокола</w:t>
+      </w:r>
+    </w:p>
+    <w:tbl>
+      <w:tblPr>
+        <w:tblStyle w:val="TableGrid"/>
+        <w:tblW w:type="auto" w:w="0"/>
+        <w:tblLook w:firstColumn="1" w:firstRow="1" w:lastColumn="0" w:lastRow="0" w:noHBand="0" w:noVBand="1" w:val="04A0"/>
+      </w:tblPr>
+      <w:tblGrid>
+        <w:gridCol w:w="2880"/>
+        <w:gridCol w:w="2880"/>
+        <w:gridCol w:w="2880"/>
+      </w:tblGrid>
+      <w:tr>
+        <w:tc>
+          <w:tcPr>
+            <w:tcW w:type="dxa" w:w="2880"/>
+            <w:shd w:val="clear" w:color="auto" w:fill="1F4E78"/>
+          </w:tcPr>
+          <w:p>
+            <w:r>
+              <w:rPr>
+                <w:b/>
+                <w:color w:val="FFFFFF"/>
+                <w:sz w:val="18"/>
+              </w:rPr>
+              <w:t>Категория</w:t>
+            </w:r>
+          </w:p>
+        </w:tc>
+        <w:tc>
+          <w:tcPr>
+            <w:tcW w:type="dxa" w:w="2880"/>
+            <w:shd w:val="clear" w:color="auto" w:fill="1F4E78"/>
+          </w:tcPr>
+          <w:p>
+            <w:r>
+              <w:rPr>
+                <w:b/>
+                <w:color w:val="FFFFFF"/>
+                <w:sz w:val="18"/>
+              </w:rPr>
+              <w:t>Количество</w:t>
+            </w:r>
+          </w:p>
+        </w:tc>
+        <w:tc>
+          <w:tcPr>
+            <w:tcW w:type="dxa" w:w="2880"/>
+            <w:shd w:val="clear" w:color="auto" w:fill="1F4E78"/>
+          </w:tcPr>
+          <w:p>
+            <w:r>
+              <w:rPr>
+                <w:b/>
+                <w:color w:val="FFFFFF"/>
+                <w:sz w:val="18"/>
+              </w:rPr>
+              <w:t>Вопросы</w:t>
+            </w:r>
+          </w:p>
+        </w:tc>
+      </w:tr>
+      <w:tr>
+        <w:tc>
+          <w:tcPr>
+            <w:tcW w:type="dxa" w:w="2880"/>
+          </w:tcPr>
+          <w:p>
+            <w:r>
+              <w:rPr>
+                <w:sz w:val="18"/>
+              </w:rPr>
+              <w:t>Исправлено</w:t>
+            </w:r>
+          </w:p>
+        </w:tc>
+        <w:tc>
+          <w:tcPr>
+            <w:tcW w:type="dxa" w:w="2880"/>
+          </w:tcPr>
+          <w:p>
+            <w:r>
+              <w:rPr>
+                <w:sz w:val="18"/>
+              </w:rPr>
+              <w:t>3</w:t>
+            </w:r>
+          </w:p>
+        </w:tc>
+        <w:tc>
+          <w:tcPr>
+            <w:tcW w:type="dxa" w:w="2880"/>
+          </w:tcPr>
+          <w:p>
+            <w:r>
+              <w:rPr>
+                <w:sz w:val="18"/>
+              </w:rPr>
+              <w:t>1.2, 1.3, 5.1</w:t>
+            </w:r>
+          </w:p>
+        </w:tc>
+      </w:tr>
+      <w:tr>
+        <w:tc>
+          <w:tcPr>
+            <w:tcW w:type="dxa" w:w="2880"/>
+          </w:tcPr>
+          <w:p>
+            <w:r>
+              <w:rPr>
+                <w:sz w:val="18"/>
+              </w:rPr>
+              <w:t>Частично улучшено</w:t>
+            </w:r>
+          </w:p>
+        </w:tc>
+        <w:tc>
+          <w:tcPr>
+            <w:tcW w:type="dxa" w:w="2880"/>
+          </w:tcPr>
+          <w:p>
+            <w:r>
+              <w:rPr>
+                <w:sz w:val="18"/>
+              </w:rPr>
+              <w:t>1</w:t>
+            </w:r>
+          </w:p>
+        </w:tc>
+        <w:tc>
+          <w:tcPr>
+            <w:tcW w:type="dxa" w:w="2880"/>
+          </w:tcPr>
+          <w:p>
+            <w:r>
+              <w:rPr>
+                <w:sz w:val="18"/>
+              </w:rPr>
+              <w:t>3.2</w:t>
+            </w:r>
+          </w:p>
+        </w:tc>
+      </w:tr>
+      <w:tr>
+        <w:tc>
+          <w:tcPr>
+            <w:tcW w:type="dxa" w:w="2880"/>
+          </w:tcPr>
+          <w:p>
+            <w:r>
+              <w:rPr>
+                <w:sz w:val="18"/>
+              </w:rPr>
+              <w:t>Регрессия</w:t>
+            </w:r>
+          </w:p>
+        </w:tc>
+        <w:tc>
+          <w:tcPr>
+            <w:tcW w:type="dxa" w:w="2880"/>
+          </w:tcPr>
+          <w:p>
+            <w:r>
+              <w:rPr>
+                <w:sz w:val="18"/>
+              </w:rPr>
+              <w:t>1</w:t>
+            </w:r>
+          </w:p>
+        </w:tc>
+        <w:tc>
+          <w:tcPr>
+            <w:tcW w:type="dxa" w:w="2880"/>
+          </w:tcPr>
+          <w:p>
+            <w:r>
+              <w:rPr>
+                <w:sz w:val="18"/>
+              </w:rPr>
+              <w:t>2.1</w:t>
+            </w:r>
+          </w:p>
+        </w:tc>
+      </w:tr>
+      <w:tr>
+        <w:tc>
+          <w:tcPr>
+            <w:tcW w:type="dxa" w:w="2880"/>
+          </w:tcPr>
+          <w:p>
+            <w:r>
+              <w:rPr>
+                <w:sz w:val="18"/>
+              </w:rPr>
+              <w:t>Без изменений — ошибка сохраняется</w:t>
+            </w:r>
+          </w:p>
+        </w:tc>
+        <w:tc>
+          <w:tcPr>
+            <w:tcW w:type="dxa" w:w="2880"/>
+          </w:tcPr>
+          <w:p>
+            <w:r>
+              <w:rPr>
+                <w:sz w:val="18"/>
+              </w:rPr>
+              <w:t>2</w:t>
+            </w:r>
+          </w:p>
+        </w:tc>
+        <w:tc>
+          <w:tcPr>
+            <w:tcW w:type="dxa" w:w="2880"/>
+          </w:tcPr>
+          <w:p>
+            <w:r>
+              <w:rPr>
+                <w:sz w:val="18"/>
+              </w:rPr>
+              <w:t>2.2, 2.3</w:t>
+            </w:r>
+          </w:p>
+        </w:tc>
+      </w:tr>
+      <w:tr>
+        <w:tc>
+          <w:tcPr>
+            <w:tcW w:type="dxa" w:w="2880"/>
+          </w:tcPr>
+          <w:p>
+            <w:r>
+              <w:rPr>
+                <w:sz w:val="18"/>
+              </w:rPr>
+              <w:t>Без изменений — верно (не были ошибками)</w:t>
+            </w:r>
+          </w:p>
+        </w:tc>
+        <w:tc>
+          <w:tcPr>
+            <w:tcW w:type="dxa" w:w="2880"/>
+          </w:tcPr>
+          <w:p>
+            <w:r>
+              <w:rPr>
+                <w:sz w:val="18"/>
+              </w:rPr>
+              <w:t>8</w:t>
+            </w:r>
+          </w:p>
+        </w:tc>
+        <w:tc>
+          <w:tcPr>
+            <w:tcW w:type="dxa" w:w="2880"/>
+          </w:tcPr>
+          <w:p>
+            <w:r>
+              <w:rPr>
+                <w:sz w:val="18"/>
+              </w:rPr>
+              <w:t>1.1, 3.1, 3.3, 4.1, 4.2, 4.3, 5.3, 6.1</w:t>
+            </w:r>
+          </w:p>
+        </w:tc>
+      </w:tr>
+      <w:tr>
+        <w:tc>
+          <w:tcPr>
+            <w:tcW w:type="dxa" w:w="2880"/>
+          </w:tcPr>
+          <w:p>
+            <w:r>
+              <w:rPr>
+                <w:sz w:val="18"/>
+              </w:rPr>
+              <w:t>Не перепроверено</w:t>
+            </w:r>
+          </w:p>
+        </w:tc>
+        <w:tc>
+          <w:tcPr>
+            <w:tcW w:type="dxa" w:w="2880"/>
+          </w:tcPr>
+          <w:p>
+            <w:r>
+              <w:rPr>
+                <w:sz w:val="18"/>
+              </w:rPr>
+              <w:t>2</w:t>
+            </w:r>
+          </w:p>
+        </w:tc>
+        <w:tc>
+          <w:tcPr>
+            <w:tcW w:type="dxa" w:w="2880"/>
+          </w:tcPr>
+          <w:p>
+            <w:r>
+              <w:rPr>
+                <w:sz w:val="18"/>
+              </w:rPr>
+              <w:t>6.2, 6.3</w:t>
             </w:r>
           </w:p>
         </w:tc>
@@ -933,7 +1906,7 @@
     <w:p/>
     <w:p>
       <w:r>
-        <w:t>Плюс 4 вопроса, ранее закрытых как «ответ был верным при имеющемся корпусе» (4.1, 4.3) или «источник действительно отсутствует» (4.2, 5.1) — не тестировались повторно, поскольку по ним не ожидается изменений.</w:t>
+        <w:t>Требует уточнения — важная деталь по исправленным вопросам: в цитатах 1.2/1.3 источник указан как И-16-01-11.doc (расширение .doc, не .docx) — то есть починка произошла не через пересохранение в .docx, как предполагала рекомендация в pilot-test-01-analysis.md, а каким-то другим образом (переиндексация на стороне платформы). Нужно уточнить у команды платформы, что именно было сделано между 11.09 и 12.09.</w:t>
       </w:r>
     </w:p>
     <w:p>
@@ -941,7 +1914,7 @@
         <w:pStyle w:val="Heading2"/>
       </w:pPr>
       <w:r>
-        <w:t>6. Рекомендация</w:t>
+        <w:t>8. Рекомендация</w:t>
       </w:r>
     </w:p>
     <w:p>
@@ -949,7 +1922,7 @@
         <w:pStyle w:val="ListNumber"/>
       </w:pPr>
       <w:r>
-        <w:t>Срочно, до продолжения ре-теста — разобраться, что такое Datafortest07.07.xlsx и почему карточка источника по вопросу 2.1 не совпадает с тем, что названо в тексте ответа. Это не просто «ещё одна ошибка в очереди» — расхождение текста и реального источника ставит под вопрос достоверность цитирования источников в принципе, не только по этому вопросу.</w:t>
+        <w:t>Срочно, до чистки/перезаливки корпуса — разобраться, почему карточка источника дважды подряд показывала файл, не совпадающий с тем, что назван в тексте ответа (Datafortest07.07.xlsx, «глоссарий»). Это системный риск достоверности цитирования.</w:t>
       </w:r>
     </w:p>
     <w:p>
@@ -957,7 +1930,7 @@
         <w:pStyle w:val="ListNumber"/>
       </w:pPr>
       <w:r>
-        <w:t>Довести ре-тест до конца по всем 13 оставшимся вопросам — приоритет на 2.3, 6.2 (тот же класс .doc-ошибок, что и 1.2/1.3), на 5.2 (контрольный случай retrieval, а не парсинга) и на вопросы группы 2/6, соседние с 2.1/2.2 — проверить, не задело ли той же регрессией что-то ещё рядом.</w:t>
+        <w:t>Уточнить у заказчика, были ли условия теста (модель OpenAI/gpt-5.5, область поиска, сужение до коллекции «ЭКО») идентичны 11.09 и 12.09 — иначе часть сравнений «было/стало» некорректна.</w:t>
       </w:r>
     </w:p>
     <w:p>
@@ -965,7 +1938,7 @@
         <w:pStyle w:val="ListNumber"/>
       </w:pPr>
       <w:r>
-        <w:t>По вопросу 2.2 — отдельно уточнить у команды платформы, почему Д-08-04-01 не подтягивается, при том что рядом лежащий И-12-10-03 уже работает (.docx) — это два документа с похожими кодами и общей темой «корректировка заказа», не должно быть системной причины индексировать один и не индексировать другой.</w:t>
+        <w:t>Завершить снимок текущего состояния по оставшимся 2 вопросам (6.2, 6.3), прежде чем чистить корпус.</w:t>
       </w:r>
     </w:p>
     <w:p>
@@ -973,7 +1946,7 @@
         <w:pStyle w:val="ListNumber"/>
       </w:pPr>
       <w:r>
-        <w:t>Уточнить у команды платформы, что именно изменилось между 11.09 и 12.09 (переиндексация конкретных файлов, обновление парсера, что-то ещё) — без этого нельзя точно сформулировать причину ни исправлений, ни регрессии, ни отсутствия изменений.</w:t>
+        <w:t>По вопросу 2.2 — уточнить у команды платформы, почему Д-08-04-01 не подтягивается, при том что рядом лежащий И-12-10-03 уже работает.</w:t>
       </w:r>
     </w:p>
     <w:p>
@@ -981,7 +1954,15 @@
         <w:pStyle w:val="ListNumber"/>
       </w:pPr>
       <w:r>
-        <w:t>Обновить pilot-test-01-analysis.md и обе презентации только после того, как ре-тест закрыт по всем 18 вопросам и разобрана причина регрессии — промежуточный итог «2 исправлено, 1 без изменений, 1 регрессия» уже зафиксирован здесь, в отдельном протоколе.</w:t>
+        <w:t>После завершения снимка — почистить/перезалить корпус (см. converted-for-upload/) и повторить полный 18-вопросный тест заново, отдельным протоколом (pilot-test-03), сравнивая с этим снимком 12.09.</w:t>
+      </w:r>
+    </w:p>
+    <w:p>
+      <w:pPr>
+        <w:pStyle w:val="ListNumber"/>
+      </w:pPr>
+      <w:r>
+        <w:t>pilot-test-01-analysis.md и обе презентации не трогать до завершения цикла «снимок → чистка → повторный тест».</w:t>
       </w:r>
     </w:p>
     <w:sectPr>

</xml_diff>

<commit_message>
Finalize retest protocol -- all 18/18 questions retested
Final tally: 3 fixed (1.2, 1.3, 5.1), 1 partially improved (3.2), 1 regression (2.1), 4 unchanged-still-broken (2.2, 2.3, 5.2, 6.2 -- the last a service error with wrong-document retrieval on top), 9 unchanged-correct. Of the original 7 confirmed pilot errors: 3 fixed, 1 partial, 3 still broken. 5.2 confirms the retrieval root-cause-2 hypothesis exactly as predicted (readable source, answer present as text, still not found). Flagged a citation-integrity pattern (2 consecutive answers cited a UI source file unrelated to the answer text) as a priority to investigate before any corpus cleanup.

Co-Authored-By: Claude Sonnet 5 <noreply@anthropic.com>
Claude-Session: https://claude.ai/code/session_01DpSN8JwCJ3tg3JVUadr2zE
</commit_message>
<xml_diff>
--- a/docs/accounts/eco/pilot-test-02-retest-protocol.docx
+++ b/docs/accounts/eco/pilot-test-02-retest-protocol.docx
@@ -51,7 +51,7 @@
         <w:t xml:space="preserve">Статус документа: </w:t>
       </w:r>
       <w:r>
-        <w:t>снимок состояния «как есть» на дату/время каждой записи (не финальный вывод). План: зафиксировать текущее состояние по всем 18 вопросам → почистить/перезалить корпус → повторный тест с отдельным протоколом (pilot-test-03).</w:t>
+        <w:t>снимок состояния «как есть» на 12.09.2026, все 18 из 18 вопросов перепроверены. Финальная версия текущего цикла. План: почистить/перезалить корпус → повторный тест с отдельным протоколом (pilot-test-03), сравнивая с этим снимком.</w:t>
       </w:r>
     </w:p>
     <w:p>
@@ -64,7 +64,7 @@
     </w:p>
     <w:p>
       <w:r>
-        <w:t>Зафиксировано по скриншоту интерфейса платформы на 12.09.2026, 13:44-13:46:</w:t>
+        <w:t>Зафиксировано по скриншоту интерфейса платформы, 12.09.2026, 13:44-13:46:</w:t>
       </w:r>
     </w:p>
     <w:tbl>
@@ -162,7 +162,7 @@
               <w:rPr>
                 <w:sz w:val="18"/>
               </w:rPr>
-              <w:t>«Синапс.Инсайт — Ана...» (название обрезано в интерфейсе на скриншоте, точное полное название не подтверждено) + переключатель «АГЕНТ» включён</w:t>
+              <w:t>«Синапс.Инсайт — Ана...» (название обрезано в интерфейсе, точное полное название не подтверждено) + переключатель «АГЕНТ» включён</w:t>
             </w:r>
           </w:p>
         </w:tc>
@@ -218,7 +218,7 @@
               <w:rPr>
                 <w:sz w:val="18"/>
               </w:rPr>
-              <w:t>[x] «Данные (каталог и SQL)», [x] «Документы», [ ] «Интернет» (отмечен как «ВНЕШНИЙ», не использовался)</w:t>
+              <w:t>[x] «Данные (каталог и SQL)», [x] «Документы», [ ] «Интернет» (не использовался)</w:t>
             </w:r>
           </w:p>
         </w:tc>
@@ -246,7 +246,7 @@
               <w:rPr>
                 <w:sz w:val="18"/>
               </w:rPr>
-              <w:t>только «ЭКО» — сужено до 1 коллекции («Данные и документы · сужено: 1»)</w:t>
+              <w:t>только «ЭКО» — сужено до 1 коллекции</w:t>
             </w:r>
           </w:p>
         </w:tc>
@@ -289,12 +289,12 @@
         <w:t xml:space="preserve">Почему это важно: </w:t>
       </w:r>
       <w:r>
-        <w:t>ни исходный пилот от 11.09, ни этот ре-тест не документировали эти параметры явно до сих пор — если модель, режим агента или область поиска отличались между 11.09 и 12.09, часть найденных изменений («исправлено»/«регрессия»/«без изменений») может объясняться разницей в условиях запуска, а не изменениями в самом корпусе документов или парсере. Нужно уточнить у заказчика, были ли эти параметры идентичны 11.09 и 12.09 — без этого сравнение «было/стало» справедливо только при допущении, что условия не менялись.</w:t>
+        <w:t>ни исходный пилот от 11.09, ни этот ре-тест не документировали эти параметры явно до сих пор — если модель, режим агента или область поиска отличались между 11.09 и 12.09, часть найденных изменений может объясняться разницей в условиях запуска, а не изменениями в корпусе документов или парсере. Нужно уточнить у заказчика, были ли эти параметры идентичны 11.09 и 12.09.</w:t>
       </w:r>
     </w:p>
     <w:p>
       <w:r>
-        <w:t>Отдельно значимо, что область поиска включает «Данные (каталог и SQL)», а не только «Документы» — это значит, что задействован не только RAG-механизм (домены/коллекции), но потенциально и структурный SQL-слой (если у «Эко» есть такие источники — см. открытый вопрос в access-audit.md). Стоит уточнить, влияет ли эта настройка на данный конкретный тест (все вопросы пилота — про регламенты, не про табличные данные) или это просто общая настройка агента по умолчанию.</w:t>
+        <w:t>Отдельно значимо, что область поиска включает «Данные (каталог и SQL)», а не только «Документы» — задействован не только RAG-механизм, но потенциально и структурный SQL-слой (см. открытый вопрос в access-audit.md).</w:t>
       </w:r>
     </w:p>
     <w:p>
@@ -307,12 +307,12 @@
     </w:p>
     <w:p>
       <w:r>
-        <w:t>В разборе исходного пилота 5 из 7 подтверждённых ошибок были связаны с одной вероятной причиной: пять источников лежали в старом формате .doc, который не открылся ни в LibreOffice, ни в pandoc при независимой проверке. Была выдвинута гипотеза: если пайплайн загрузки документов платформы использует похожую конвертацию, эти документы могли не проиндексироваться или проиндексироваться пусто — отсюда ответы «не найдено» там, где текст реально присутствовал в файле.</w:t>
+        <w:t>В разборе исходного пилота 5 из 7 подтверждённых ошибок были связаны с одной вероятной причиной: пять источников лежали в старом формате .doc, не открывшемся ни в LibreOffice, ни в pandoc при независимой проверке. Была выдвинута гипотеза: если пайплайн загрузки документов платформы использует похожую конвертацию, эти документы могли не проиндексироваться — отсюда ответы «не найдено» там, где текст реально присутствовал в файле.</w:t>
       </w:r>
     </w:p>
     <w:p>
       <w:r>
-        <w:t>12.09.2026 пользователь начал повторно задавать те же вопросы в чате платформы. Настоящий протокол фиксирует то, что уже подтверждено скриншотами живого чата на этот момент: 2 из 7 ошибок пилота исправлены, 2 из 7 без изменений (плюс частичное улучшение по третьей), и параллельно обнаружена 1 регрессия на вопросе, который в исходном пилоте отвечался верно. Картина смешанная, не однозначно позитивная. По состоянию на текущую версию протокола перепроверены 17 из 18 вопросов.</w:t>
+        <w:t>12.09.2026 все 18 вопросов пилота заданы повторно. Итог: 3 из 7 ошибок пилота исправлены, 1 частично улучшена, 3 без изменений (включая 1 нерабочую из-за служебной ошибки сервиса), 1 регрессия, плюс паттерн из 2 аномалий цитирования источника. Картина смешанная — не «всё починили» и не «ничего не изменилось».</w:t>
       </w:r>
     </w:p>
     <w:p>
@@ -320,7 +320,7 @@
         <w:pStyle w:val="Heading2"/>
       </w:pPr>
       <w:r>
-        <w:t>2. Что изменилось — подтверждено скриншотами</w:t>
+        <w:t>2. Исправлено</w:t>
       </w:r>
     </w:p>
     <w:tbl>
@@ -441,7 +441,7 @@
               <w:rPr>
                 <w:sz w:val="18"/>
               </w:rPr>
-              <w:t>Я технолог ЛР. Кто управляет процессом, когда мы делаем экспериментальную партию?</w:t>
+              <w:t>Кто управляет процессом экспериментальной партии?</w:t>
             </w:r>
           </w:p>
         </w:tc>
@@ -454,7 +454,7 @@
               <w:rPr>
                 <w:sz w:val="18"/>
               </w:rPr>
-              <w:t>«Нет чёткого ответа» — ответственный не найден</w:t>
+              <w:t>«Нет чёткого ответа»</w:t>
             </w:r>
           </w:p>
         </w:tc>
@@ -509,7 +509,7 @@
               <w:rPr>
                 <w:sz w:val="18"/>
               </w:rPr>
-              <w:t>Я мастер на производстве. В заказе увидел пометку «Экспериментальная». Мои действия?</w:t>
+              <w:t>Действия мастера при пометке «Экспериментальная»</w:t>
             </w:r>
           </w:p>
         </w:tc>
@@ -522,7 +522,7 @@
               <w:rPr>
                 <w:sz w:val="18"/>
               </w:rPr>
-              <w:t>«Частичный ответ» — специальные действия не найдены</w:t>
+              <w:t>«Частичный ответ»</w:t>
             </w:r>
           </w:p>
         </w:tc>
@@ -536,7 +536,7 @@
               <w:rPr>
                 <w:sz w:val="18"/>
               </w:rPr>
-              <w:t>Отвечено верно: «При пометке «Экспериментальная» выполняйте выработку по указаниям технолога лаборатории...»</w:t>
+              <w:t>Отвечено верно: «...по указаниям технолога лаборатории...»</w:t>
             </w:r>
           </w:p>
         </w:tc>
@@ -549,7 +549,7 @@
               <w:rPr>
                 <w:sz w:val="18"/>
               </w:rPr>
-              <w:t>И-09-08-02.doc — 61%; И-16-01-11.doc — 60%; И-15-06-08.docx — 57%; И-08-02-10.doc — 56%</w:t>
+              <w:t>И-09-08-02.doc 61%; И-16-01-11.doc 60%; И-15-06-08.docx 57%; И-08-02-10.doc 56%</w:t>
             </w:r>
           </w:p>
         </w:tc>
@@ -577,7 +577,7 @@
               <w:rPr>
                 <w:sz w:val="18"/>
               </w:rPr>
-              <w:t>Я технолог производства. Сырьё на складе «Проверка ОКК». Как получить?</w:t>
+              <w:t>Получение сырья со склада «Проверка ОКК»</w:t>
             </w:r>
           </w:p>
         </w:tc>
@@ -590,7 +590,7 @@
               <w:rPr>
                 <w:sz w:val="18"/>
               </w:rPr>
-              <w:t>«Частичный ответ» — «прямого порядка... нет» (был открытым вопросом, не в числе 7 ошибок)</w:t>
+              <w:t>«Частичный ответ» — прямого порядка нет (открытый вопрос)</w:t>
             </w:r>
           </w:p>
         </w:tc>
@@ -604,7 +604,7 @@
               <w:rPr>
                 <w:sz w:val="18"/>
               </w:rPr>
-              <w:t>Полный пошаговый ответ (5 шагов) именно для склада «Проверка ОКК»</w:t>
+              <w:t>Полный пошаговый ответ (5 шагов)</w:t>
             </w:r>
           </w:p>
         </w:tc>
@@ -617,7 +617,7 @@
               <w:rPr>
                 <w:sz w:val="18"/>
               </w:rPr>
-              <w:t>ПР-09-00-14.doc — 49%; ПР-03-00-12.doc — 65%</w:t>
+              <w:t>ПР-09-00-14.doc 49%; ПР-03-00-12.doc 65%</w:t>
             </w:r>
           </w:p>
         </w:tc>
@@ -626,7 +626,7 @@
     <w:p/>
     <w:p>
       <w:r>
-        <w:t>Дополнительно перепроверен вопрос 1.1 (не входил в число ошибок пилота) — ответ не изменился, платформа по-прежнему отвечает верно, источник тот же (ПР-03-00-12.doc, 60%).</w:t>
+        <w:t>Дополнительно вопрос 1.1 (не ошибка) — без изменений, верно, источник тот же.</w:t>
       </w:r>
     </w:p>
     <w:p>
@@ -727,7 +727,7 @@
                 <w:color w:val="FFFFFF"/>
                 <w:sz w:val="18"/>
               </w:rPr>
-              <w:t>Источник при ре-тесте</w:t>
+              <w:t>Источник</w:t>
             </w:r>
           </w:p>
         </w:tc>
@@ -755,7 +755,7 @@
               <w:rPr>
                 <w:sz w:val="18"/>
               </w:rPr>
-              <w:t>Клиент попросил поменять характеристику товара, заявка на сборку уже распечатана</w:t>
+              <w:t>Смена характеристики товара, заявка распечатана</w:t>
             </w:r>
           </w:p>
         </w:tc>
@@ -768,7 +768,7 @@
               <w:rPr>
                 <w:sz w:val="18"/>
               </w:rPr>
-              <w:t>«Частичный ответ» — что делать с распечатанной заявкой не описано; источник И-12-10-03 числился «не загружен»</w:t>
+              <w:t>Что делать с заявкой не описано; источник числился «не загружен»</w:t>
             </w:r>
           </w:p>
         </w:tc>
@@ -781,7 +781,7 @@
               <w:rPr>
                 <w:sz w:val="18"/>
               </w:rPr>
-              <w:t>Источник теперь подключён, появился шаг про распечатанную заявку, но точная инструкция «перепровести Заявку на комплектацию» из разбора ошибок всё ещё не дана</w:t>
+              <w:t>Источник подключён, шаг про заявку появился, но точная инструкция «перепровести Заявку на комплектацию» не дана</w:t>
             </w:r>
           </w:p>
         </w:tc>
@@ -805,7 +805,7 @@
         <w:pStyle w:val="Heading2"/>
       </w:pPr>
       <w:r>
-        <w:t>4. Регрессия — вопрос, который раньше отвечался верно, а теперь нет</w:t>
+        <w:t>4. Регрессия</w:t>
       </w:r>
     </w:p>
     <w:tbl>
@@ -898,7 +898,7 @@
                 <w:color w:val="FFFFFF"/>
                 <w:sz w:val="18"/>
               </w:rPr>
-              <w:t>Источник при ре-тесте</w:t>
+              <w:t>Источник</w:t>
             </w:r>
           </w:p>
         </w:tc>
@@ -926,7 +926,7 @@
               <w:rPr>
                 <w:sz w:val="18"/>
               </w:rPr>
-              <w:t>Какие поля заполняет оператор после фасовки продукции?</w:t>
+              <w:t>Поля после фасовки</w:t>
             </w:r>
           </w:p>
         </w:tc>
@@ -939,7 +939,7 @@
               <w:rPr>
                 <w:sz w:val="18"/>
               </w:rPr>
-              <w:t>Чёткий ответ: «...«Кол-во тарных мест», «Общее количество», «Дата», «Фасовщик ФИО подпись».»</w:t>
+              <w:t>Чёткий ответ с точным перечнем полей</w:t>
             </w:r>
           </w:p>
         </w:tc>
@@ -953,7 +953,7 @@
               <w:rPr>
                 <w:sz w:val="18"/>
               </w:rPr>
-              <w:t>Регрессия: «Какие именно поля оператор заполняет после фасовки, в найденном фрагменте не указано.»</w:t>
+              <w:t>Регрессия: «поля... не указано»</w:t>
             </w:r>
           </w:p>
         </w:tc>
@@ -966,24 +966,18 @@
               <w:rPr>
                 <w:sz w:val="18"/>
               </w:rPr>
-              <w:t>Текст ссылается на И-08-02-10 и ПР-08-00-14, но карточка показывает Datafortest07.07.xlsx (64%), не входящий в известный корпус СМК</w:t>
+              <w:t>Текст ссылается на И-08-02-10/ПР-08-00-14, карточка показывает Datafortest07.07.xlsx (64%) — чужой файл</w:t>
             </w:r>
           </w:p>
         </w:tc>
       </w:tr>
     </w:tbl>
-    <w:p/>
-    <w:p>
-      <w:r>
-        <w:t>Это не «ещё не перепроверено» — это ухудшение относительно исходного пилота. Дополнительная тревожная деталь — расхождение между тем, что написано в тексте ответа, и тем, что реально показано в карточке источника.</w:t>
-      </w:r>
-    </w:p>
     <w:p>
       <w:pPr>
         <w:pStyle w:val="Heading2"/>
       </w:pPr>
       <w:r>
-        <w:t>5. Без изменений — ошибки, которые остались ошибками</w:t>
+        <w:t>5. Без изменений — ошибка сохраняется</w:t>
       </w:r>
     </w:p>
     <w:tbl>
@@ -1076,7 +1070,7 @@
                 <w:color w:val="FFFFFF"/>
                 <w:sz w:val="18"/>
               </w:rPr>
-              <w:t>Источник при ре-тесте</w:t>
+              <w:t>Источник</w:t>
             </w:r>
           </w:p>
         </w:tc>
@@ -1104,7 +1098,7 @@
               <w:rPr>
                 <w:sz w:val="18"/>
               </w:rPr>
-              <w:t>Корректировка Заказа на производство при меньшем весе</w:t>
+              <w:t>Корректировка при меньшем весе</w:t>
             </w:r>
           </w:p>
         </w:tc>
@@ -1117,7 +1111,7 @@
               <w:rPr>
                 <w:sz w:val="18"/>
               </w:rPr>
-              <w:t>«Частичный ответ» — только общая процедура для Заказа покупателя</w:t>
+              <w:t>Только общая процедура</w:t>
             </w:r>
           </w:p>
         </w:tc>
@@ -1131,7 +1125,7 @@
               <w:rPr>
                 <w:sz w:val="18"/>
               </w:rPr>
-              <w:t>Без изменений: тот же общий ответ. Конкретная процедура (Д-08-04-01, п. 3.5.1-3.5.5) по-прежнему не дана</w:t>
+              <w:t>Без изменений, Д-08-04-01 не цитируется</w:t>
             </w:r>
           </w:p>
         </w:tc>
@@ -1144,7 +1138,7 @@
               <w:rPr>
                 <w:sz w:val="18"/>
               </w:rPr>
-              <w:t>И-12-10-03.docx — 72%. Д-08-04-01 по-прежнему не цитируется</w:t>
+              <w:t>И-12-10-03.docx 72%</w:t>
             </w:r>
           </w:p>
         </w:tc>
@@ -1172,7 +1166,7 @@
               <w:rPr>
                 <w:sz w:val="18"/>
               </w:rPr>
-              <w:t>Высота сброса тары 1,5-5 л</w:t>
+              <w:t>Высота сброса тары</w:t>
             </w:r>
           </w:p>
         </w:tc>
@@ -1185,7 +1179,7 @@
               <w:rPr>
                 <w:sz w:val="18"/>
               </w:rPr>
-              <w:t>«Нет чёткого ответа» — высота не указана</w:t>
+              <w:t>Высота не указана</w:t>
             </w:r>
           </w:p>
         </w:tc>
@@ -1199,7 +1193,7 @@
               <w:rPr>
                 <w:sz w:val="18"/>
               </w:rPr>
-              <w:t>Без изменений: высота (0,8 м) по-прежнему не дана</w:t>
+              <w:t>Без изменений, высота не дана</w:t>
             </w:r>
           </w:p>
         </w:tc>
@@ -1212,7 +1206,143 @@
               <w:rPr>
                 <w:sz w:val="18"/>
               </w:rPr>
-              <w:t>Текст называет Д-09-01-17, карточка показывает файл «глоссарий» (100%) — вторая аномалия цитирования подряд</w:t>
+              <w:t>Карточка — файл «глоссарий» (100%), не совпадает с текстом</w:t>
+            </w:r>
+          </w:p>
+        </w:tc>
+      </w:tr>
+      <w:tr>
+        <w:tc>
+          <w:tcPr>
+            <w:tcW w:type="dxa" w:w="1728"/>
+          </w:tcPr>
+          <w:p>
+            <w:r>
+              <w:rPr>
+                <w:sz w:val="18"/>
+              </w:rPr>
+              <w:t>5.2</w:t>
+            </w:r>
+          </w:p>
+        </w:tc>
+        <w:tc>
+          <w:tcPr>
+            <w:tcW w:type="dxa" w:w="1728"/>
+          </w:tcPr>
+          <w:p>
+            <w:r>
+              <w:rPr>
+                <w:sz w:val="18"/>
+              </w:rPr>
+              <w:t>Приоритет заявок на ремонт</w:t>
+            </w:r>
+          </w:p>
+        </w:tc>
+        <w:tc>
+          <w:tcPr>
+            <w:tcW w:type="dxa" w:w="1728"/>
+          </w:tcPr>
+          <w:p>
+            <w:r>
+              <w:rPr>
+                <w:sz w:val="18"/>
+              </w:rPr>
+              <w:t>Правило только для одного типа аварий</w:t>
+            </w:r>
+          </w:p>
+        </w:tc>
+        <w:tc>
+          <w:tcPr>
+            <w:tcW w:type="dxa" w:w="1728"/>
+            <w:shd w:val="clear" w:color="auto" w:fill="FFF2CC"/>
+          </w:tcPr>
+          <w:p>
+            <w:r>
+              <w:rPr>
+                <w:sz w:val="18"/>
+              </w:rPr>
+              <w:t>Без изменений — «не найдено»</w:t>
+            </w:r>
+          </w:p>
+        </w:tc>
+        <w:tc>
+          <w:tcPr>
+            <w:tcW w:type="dxa" w:w="1728"/>
+          </w:tcPr>
+          <w:p>
+            <w:r>
+              <w:rPr>
+                <w:sz w:val="18"/>
+              </w:rPr>
+              <w:t>Источник не показан</w:t>
+            </w:r>
+          </w:p>
+        </w:tc>
+      </w:tr>
+      <w:tr>
+        <w:tc>
+          <w:tcPr>
+            <w:tcW w:type="dxa" w:w="1728"/>
+          </w:tcPr>
+          <w:p>
+            <w:r>
+              <w:rPr>
+                <w:sz w:val="18"/>
+              </w:rPr>
+              <w:t>6.2</w:t>
+            </w:r>
+          </w:p>
+        </w:tc>
+        <w:tc>
+          <w:tcPr>
+            <w:tcW w:type="dxa" w:w="1728"/>
+          </w:tcPr>
+          <w:p>
+            <w:r>
+              <w:rPr>
+                <w:sz w:val="18"/>
+              </w:rPr>
+              <w:t>Добавление Спецификации в 1С-8</w:t>
+            </w:r>
+          </w:p>
+        </w:tc>
+        <w:tc>
+          <w:tcPr>
+            <w:tcW w:type="dxa" w:w="1728"/>
+          </w:tcPr>
+          <w:p>
+            <w:r>
+              <w:rPr>
+                <w:sz w:val="18"/>
+              </w:rPr>
+              <w:t>Процесс есть, инструкции по 1С нет</w:t>
+            </w:r>
+          </w:p>
+        </w:tc>
+        <w:tc>
+          <w:tcPr>
+            <w:tcW w:type="dxa" w:w="1728"/>
+            <w:shd w:val="clear" w:color="auto" w:fill="FFF2CC"/>
+          </w:tcPr>
+          <w:p>
+            <w:r>
+              <w:rPr>
+                <w:sz w:val="18"/>
+              </w:rPr>
+              <w:t>Служебная ошибка модели (дважды)</w:t>
+            </w:r>
+          </w:p>
+        </w:tc>
+        <w:tc>
+          <w:tcPr>
+            <w:tcW w:type="dxa" w:w="1728"/>
+          </w:tcPr>
+          <w:p>
+            <w:r>
+              <w:rPr>
+                <w:sz w:val="18"/>
+              </w:rPr>
+              <w:t>Показаны Д-08-03-01/Д-08-04-01 — не по теме; И-08-05-08 не подтянут</w:t>
             </w:r>
           </w:p>
         </w:tc>
@@ -1224,10 +1354,32 @@
         <w:rPr>
           <w:b/>
         </w:rPr>
+        <w:t xml:space="preserve">5.2 — контрольный retrieval-случай. </w:t>
+      </w:r>
+      <w:r>
+        <w:t>Прямое подтверждение «Корневой причины №2» из proverka-zdorovya-zagruzki-predlozhenie.md: источник читаем, ответ есть текстом, но retrieval его не находит — правки, починившие 1.2/1.3, эту проблему не затронули, как и предсказывалось.</w:t>
+      </w:r>
+    </w:p>
+    <w:p>
+      <w:r>
+        <w:rPr>
+          <w:b/>
+        </w:rPr>
+        <w:t xml:space="preserve">6.2 — двойная проблема. </w:t>
+      </w:r>
+      <w:r>
+        <w:t>Кроме служебной ошибки, retrieval до сбоя цеплялся не за тот документ.</w:t>
+      </w:r>
+    </w:p>
+    <w:p>
+      <w:r>
+        <w:rPr>
+          <w:b/>
+        </w:rPr>
         <w:t xml:space="preserve">Паттерн аномалии цитирования (2.1 и 2.3). </w:t>
       </w:r>
       <w:r>
-        <w:t>Дважды подряд карточка источника в интерфейсе чата показывает файл, не совпадающий с тем, что назван в тексте ответа, оба раза с высоким процентом релевантности. Это не похоже на случайный шум ранжирования — скорее на путаницу в том, что именно система показывает как «источник» в UI против того, что реально использовала модель. Стоит проверить это перед чисткой/перезаливкой корпуса.</w:t>
+        <w:t>Дважды подряд карточка источника показывает файл, не совпадающий с текстом ответа, оба раза с высоким процентом релевантности — похоже на системную путаницу в отображении источника, а не на шум ранжирования.</w:t>
       </w:r>
     </w:p>
     <w:p>
@@ -1235,7 +1387,7 @@
         <w:pStyle w:val="Heading2"/>
       </w:pPr>
       <w:r>
-        <w:t>6. Без изменений — верные ответы (не входили в число ошибок)</w:t>
+        <w:t>6. Без изменений — верные ответы (не были ошибками)</w:t>
       </w:r>
     </w:p>
     <w:tbl>
@@ -1322,7 +1474,7 @@
               <w:rPr>
                 <w:sz w:val="18"/>
               </w:rPr>
-              <w:t>Технолог ПО получает сырьё на производство</w:t>
+              <w:t>Получение сырья технологом ПО</w:t>
             </w:r>
           </w:p>
         </w:tc>
@@ -1335,7 +1487,7 @@
               <w:rPr>
                 <w:sz w:val="18"/>
               </w:rPr>
-              <w:t>Без изменений, верно, источники релевантны, аномалий нет</w:t>
+              <w:t>Без изменений, верно</w:t>
             </w:r>
           </w:p>
         </w:tc>
@@ -1363,7 +1515,7 @@
               <w:rPr>
                 <w:sz w:val="18"/>
               </w:rPr>
-              <w:t>Продукцию забраковали — действия</w:t>
+              <w:t>Забракованная продукция — действия</w:t>
             </w:r>
           </w:p>
         </w:tc>
@@ -1376,7 +1528,7 @@
               <w:rPr>
                 <w:sz w:val="18"/>
               </w:rPr>
-              <w:t>Без изменений, верно, ответ даже детальнее (формы 03-01/03-03, конкретные роли)</w:t>
+              <w:t>Без изменений, верно, детальнее</w:t>
             </w:r>
           </w:p>
         </w:tc>
@@ -1417,7 +1569,7 @@
               <w:rPr>
                 <w:sz w:val="18"/>
               </w:rPr>
-              <w:t>Без изменений — верное «не найдено» (детали физически нет в корпусе, подтверждено в pilot-test-01)</w:t>
+              <w:t>Без изменений — верное «не найдено» (детали нет в корпусе)</w:t>
             </w:r>
           </w:p>
         </w:tc>
@@ -1458,7 +1610,7 @@
               <w:rPr>
                 <w:sz w:val="18"/>
               </w:rPr>
-              <w:t>Без изменений — вопрос остаётся открытым, найдено смежное поле «Оценка результативности», но не сама периодичность</w:t>
+              <w:t>Без изменений — открыт, найдено смежное поле, не сама периодичность</w:t>
             </w:r>
           </w:p>
         </w:tc>
@@ -1499,7 +1651,7 @@
               <w:rPr>
                 <w:sz w:val="18"/>
               </w:rPr>
-              <w:t>Без изменений — верное «не найдено» (сама форма как бланк не в корпусе), источник цитирования сменился на другой файл</w:t>
+              <w:t>Без изменений — верное «не найдено» (бланка нет в корпусе)</w:t>
             </w:r>
           </w:p>
         </w:tc>
@@ -1540,7 +1692,7 @@
               <w:rPr>
                 <w:sz w:val="18"/>
               </w:rPr>
-              <w:t>Без изменений, верно, ответ детальнее с постатейной сверкой источников</w:t>
+              <w:t>Без изменений, верно, детальнее</w:t>
             </w:r>
           </w:p>
         </w:tc>
@@ -1581,7 +1733,48 @@
               <w:rPr>
                 <w:sz w:val="18"/>
               </w:rPr>
-              <w:t>Без изменений, верно, ответ детальнее исходного</w:t>
+              <w:t>Без изменений, верно, детальнее</w:t>
+            </w:r>
+          </w:p>
+        </w:tc>
+      </w:tr>
+      <w:tr>
+        <w:tc>
+          <w:tcPr>
+            <w:tcW w:type="dxa" w:w="2880"/>
+          </w:tcPr>
+          <w:p>
+            <w:r>
+              <w:rPr>
+                <w:sz w:val="18"/>
+              </w:rPr>
+              <w:t>6.3</w:t>
+            </w:r>
+          </w:p>
+        </w:tc>
+        <w:tc>
+          <w:tcPr>
+            <w:tcW w:type="dxa" w:w="2880"/>
+          </w:tcPr>
+          <w:p>
+            <w:r>
+              <w:rPr>
+                <w:sz w:val="18"/>
+              </w:rPr>
+              <w:t>Входной контроль сырья</w:t>
+            </w:r>
+          </w:p>
+        </w:tc>
+        <w:tc>
+          <w:tcPr>
+            <w:tcW w:type="dxa" w:w="2880"/>
+          </w:tcPr>
+          <w:p>
+            <w:r>
+              <w:rPr>
+                <w:sz w:val="18"/>
+              </w:rPr>
+              <w:t>Без изменений, верно, детальнее (формы 09-01/03-01/03-02/03-03/03-04)</w:t>
             </w:r>
           </w:p>
         </w:tc>
@@ -1592,7 +1785,7 @@
         <w:pStyle w:val="Heading2"/>
       </w:pPr>
       <w:r>
-        <w:t>7. Итоговая сводка на момент составления протокола</w:t>
+        <w:t>7. Итоговая сводка — все 18 из 18</w:t>
       </w:r>
     </w:p>
     <w:tbl>
@@ -1802,7 +1995,7 @@
               <w:rPr>
                 <w:sz w:val="18"/>
               </w:rPr>
-              <w:t>2</w:t>
+              <w:t>4</w:t>
             </w:r>
           </w:p>
         </w:tc>
@@ -1815,7 +2008,7 @@
               <w:rPr>
                 <w:sz w:val="18"/>
               </w:rPr>
-              <w:t>2.2, 2.3</w:t>
+              <w:t>2.2, 2.3, 5.2, 6.2</w:t>
             </w:r>
           </w:p>
         </w:tc>
@@ -1830,7 +2023,7 @@
               <w:rPr>
                 <w:sz w:val="18"/>
               </w:rPr>
-              <w:t>Без изменений — верно (не были ошибками)</w:t>
+              <w:t>Без изменений — верно</w:t>
             </w:r>
           </w:p>
         </w:tc>
@@ -1843,7 +2036,7 @@
               <w:rPr>
                 <w:sz w:val="18"/>
               </w:rPr>
-              <w:t>8</w:t>
+              <w:t>9</w:t>
             </w:r>
           </w:p>
         </w:tc>
@@ -1856,48 +2049,7 @@
               <w:rPr>
                 <w:sz w:val="18"/>
               </w:rPr>
-              <w:t>1.1, 3.1, 3.3, 4.1, 4.2, 4.3, 5.3, 6.1</w:t>
-            </w:r>
-          </w:p>
-        </w:tc>
-      </w:tr>
-      <w:tr>
-        <w:tc>
-          <w:tcPr>
-            <w:tcW w:type="dxa" w:w="2880"/>
-          </w:tcPr>
-          <w:p>
-            <w:r>
-              <w:rPr>
-                <w:sz w:val="18"/>
-              </w:rPr>
-              <w:t>Не перепроверено</w:t>
-            </w:r>
-          </w:p>
-        </w:tc>
-        <w:tc>
-          <w:tcPr>
-            <w:tcW w:type="dxa" w:w="2880"/>
-          </w:tcPr>
-          <w:p>
-            <w:r>
-              <w:rPr>
-                <w:sz w:val="18"/>
-              </w:rPr>
-              <w:t>2</w:t>
-            </w:r>
-          </w:p>
-        </w:tc>
-        <w:tc>
-          <w:tcPr>
-            <w:tcW w:type="dxa" w:w="2880"/>
-          </w:tcPr>
-          <w:p>
-            <w:r>
-              <w:rPr>
-                <w:sz w:val="18"/>
-              </w:rPr>
-              <w:t>6.2, 6.3</w:t>
+              <w:t>1.1, 3.1, 3.3, 4.1, 4.2, 4.3, 5.3, 6.1, 6.3</w:t>
             </w:r>
           </w:p>
         </w:tc>
@@ -1906,7 +2058,18 @@
     <w:p/>
     <w:p>
       <w:r>
-        <w:t>Требует уточнения — важная деталь по исправленным вопросам: в цитатах 1.2/1.3 источник указан как И-16-01-11.doc (расширение .doc, не .docx) — то есть починка произошла не через пересохранение в .docx, как предполагала рекомендация в pilot-test-01-analysis.md, а каким-то другим образом (переиндексация на стороне платформы). Нужно уточнить у команды платформы, что именно было сделано между 11.09 и 12.09.</w:t>
+        <w:t>Из исходных 7 подтверждённых ошибок пилота: 3 исправлены (1.2, 1.3, 5.1 — последняя формально была открытым вопросом), 1 частично улучшена (3.2), 3 остаются без изменений (2.2, 2.3, 6.2 — последняя дополнительно со служебной ошибкой), плюс контрольный случай 5.2 подтверждён как отдельная retrieval-проблема.</w:t>
+      </w:r>
+    </w:p>
+    <w:p>
+      <w:r>
+        <w:rPr>
+          <w:b/>
+        </w:rPr>
+        <w:t xml:space="preserve">Важная деталь по исправленным вопросам. </w:t>
+      </w:r>
+      <w:r>
+        <w:t>В цитатах 1.2/1.3 источник указан как И-16-01-11.doc (расширение .doc, не .docx) — починка произошла не через пересохранение в .docx, а каким-то другим образом. Изменение точечное — не «почини всё .doc разом»: 2.2/2.3/6.2 остались сломаны на других документах.</w:t>
       </w:r>
     </w:p>
     <w:p>
@@ -1922,7 +2085,7 @@
         <w:pStyle w:val="ListNumber"/>
       </w:pPr>
       <w:r>
-        <w:t>Срочно, до чистки/перезаливки корпуса — разобраться, почему карточка источника дважды подряд показывала файл, не совпадающий с тем, что назван в тексте ответа (Datafortest07.07.xlsx, «глоссарий»). Это системный риск достоверности цитирования.</w:t>
+        <w:t>Срочно, до чистки/перезаливки корпуса — разобраться, почему карточка источника дважды подряд показывала файл, не совпадающий с текстом ответа (Datafortest07.07.xlsx, «глоссарий»).</w:t>
       </w:r>
     </w:p>
     <w:p>
@@ -1930,7 +2093,7 @@
         <w:pStyle w:val="ListNumber"/>
       </w:pPr>
       <w:r>
-        <w:t>Уточнить у заказчика, были ли условия теста (модель OpenAI/gpt-5.5, область поиска, сужение до коллекции «ЭКО») идентичны 11.09 и 12.09 — иначе часть сравнений «было/стало» некорректна.</w:t>
+        <w:t>Уточнить у заказчика, были ли условия теста (модель OpenAI/gpt-5.5, область поиска, сужение до «ЭКО») идентичны 11.09 и 12.09.</w:t>
       </w:r>
     </w:p>
     <w:p>
@@ -1938,7 +2101,7 @@
         <w:pStyle w:val="ListNumber"/>
       </w:pPr>
       <w:r>
-        <w:t>Завершить снимок текущего состояния по оставшимся 2 вопросам (6.2, 6.3), прежде чем чистить корпус.</w:t>
+        <w:t>Повторить вопрос 6.2 отдельно (ошибка могла быть разовой) — и отдельно проверить, почему retrieval цеплялся не за тот документ.</w:t>
       </w:r>
     </w:p>
     <w:p>
@@ -1946,7 +2109,7 @@
         <w:pStyle w:val="ListNumber"/>
       </w:pPr>
       <w:r>
-        <w:t>По вопросу 2.2 — уточнить у команды платформы, почему Д-08-04-01 не подтягивается, при том что рядом лежащий И-12-10-03 уже работает.</w:t>
+        <w:t>По вопросу 2.2 — уточнить, почему Д-08-04-01 не подтягивается, при том что И-12-10-03 уже работает.</w:t>
       </w:r>
     </w:p>
     <w:p>
@@ -1954,7 +2117,7 @@
         <w:pStyle w:val="ListNumber"/>
       </w:pPr>
       <w:r>
-        <w:t>После завершения снимка — почистить/перезалить корпус (см. converted-for-upload/) и повторить полный 18-вопросный тест заново, отдельным протоколом (pilot-test-03), сравнивая с этим снимком 12.09.</w:t>
+        <w:t>Уточнить у команды платформы, что именно изменилось между 11.09 и 12.09.</w:t>
       </w:r>
     </w:p>
     <w:p>
@@ -1962,7 +2125,15 @@
         <w:pStyle w:val="ListNumber"/>
       </w:pPr>
       <w:r>
-        <w:t>pilot-test-01-analysis.md и обе презентации не трогать до завершения цикла «снимок → чистка → повторный тест».</w:t>
+        <w:t>Почистить/перезалить корпус (converted-for-upload/) и повторить полный тест отдельным протоколом (pilot-test-03), сравнивая с этим снимком.</w:t>
+      </w:r>
+    </w:p>
+    <w:p>
+      <w:pPr>
+        <w:pStyle w:val="ListNumber"/>
+      </w:pPr>
+      <w:r>
+        <w:t>pilot-test-01-analysis.md и презентации не трогать до завершения цикла «снимок → чистка → повторный тест».</w:t>
       </w:r>
     </w:p>
     <w:sectPr>

</xml_diff>

<commit_message>
Add было→стало summary table and time column to retest protocol
Adds a consolidated "было (11.09) → стало (12.09)" overview table
covering all 18 questions to the retest protocol (md/docx), plus an
explicit "Дата и время" row in the test-conditions table noting the
single known timestamp range (13:44-13:46) with no per-question times
available.

In the tracking spreadsheet, adds a "Время" column carrying that same
range, and a new "Категория" column (Исправлено/Регрессия/Без
изменений и т.д.) colored per the existing green/yellow/red/grey
legend for at-a-glance scanning.

Co-Authored-By: Claude Sonnet 5 <noreply@anthropic.com>
Claude-Session: https://claude.ai/code/session_01DpSN8JwCJ3tg3JVUadr2zE
</commit_message>
<xml_diff>
--- a/docs/accounts/eco/pilot-test-02-retest-protocol.docx
+++ b/docs/accounts/eco/pilot-test-02-retest-protocol.docx
@@ -107,6 +107,28 @@
                 <w:sz w:val="18"/>
               </w:rPr>
               <w:t>Значение</w:t>
+            </w:r>
+          </w:p>
+        </w:tc>
+      </w:tr>
+      <w:tr>
+        <w:tc>
+          <w:tcPr>
+            <w:tcW w:type="dxa" w:w="4320"/>
+          </w:tcPr>
+          <w:p>
+            <w:r>
+              <w:t>Дата и время</w:t>
+            </w:r>
+          </w:p>
+        </w:tc>
+        <w:tc>
+          <w:tcPr>
+            <w:tcW w:type="dxa" w:w="4320"/>
+          </w:tcPr>
+          <w:p>
+            <w:r>
+              <w:t>12.09.2026, 13:44–13:46 — единый диапазон по скриншоту условий теста; отдельных отметок времени по каждому из 18 вопросов нет</w:t>
             </w:r>
           </w:p>
         </w:tc>
@@ -315,6 +337,1036 @@
         <w:t>12.09.2026 все 18 вопросов пилота заданы повторно. Итог: 3 из 7 ошибок пилота исправлены, 1 частично улучшена, 3 без изменений (включая 1 нерабочую из-за служебной ошибки сервиса), 1 регрессия, плюс паттерн из 2 аномалий цитирования источника. Картина смешанная — не «всё починили» и не «ничего не изменилось».</w:t>
       </w:r>
     </w:p>
+    <w:p>
+      <w:pPr>
+        <w:pStyle w:val="Heading2"/>
+      </w:pPr>
+      <w:r>
+        <w:t>1a. Сводная таблица «было → стало» — все 18 вопросов</w:t>
+      </w:r>
+    </w:p>
+    <w:p>
+      <w:r>
+        <w:t>Краткий обзор по каждому вопросу для быстрой сверки; полные цитаты и разбор — в разделах 2–6 ниже.</w:t>
+      </w:r>
+    </w:p>
+    <w:tbl>
+      <w:tblPr>
+        <w:tblStyle w:val="TableGrid"/>
+        <w:tblW w:type="auto" w:w="0"/>
+        <w:tblLook w:firstColumn="1" w:firstRow="1" w:lastColumn="0" w:lastRow="0" w:noHBand="0" w:noVBand="1" w:val="04A0"/>
+      </w:tblPr>
+      <w:tblGrid>
+        <w:gridCol w:w="1728"/>
+        <w:gridCol w:w="1728"/>
+        <w:gridCol w:w="1728"/>
+        <w:gridCol w:w="1728"/>
+        <w:gridCol w:w="1728"/>
+      </w:tblGrid>
+      <w:tr>
+        <w:tc>
+          <w:tcPr>
+            <w:tcW w:type="dxa" w:w="1728"/>
+          </w:tcPr>
+          <w:p>
+            <w:r>
+              <w:rPr>
+                <w:b/>
+              </w:rPr>
+              <w:t>№</w:t>
+            </w:r>
+          </w:p>
+        </w:tc>
+        <w:tc>
+          <w:tcPr>
+            <w:tcW w:type="dxa" w:w="1728"/>
+          </w:tcPr>
+          <w:p>
+            <w:r>
+              <w:rPr>
+                <w:b/>
+              </w:rPr>
+              <w:t>Вопрос</w:t>
+            </w:r>
+          </w:p>
+        </w:tc>
+        <w:tc>
+          <w:tcPr>
+            <w:tcW w:type="dxa" w:w="1728"/>
+          </w:tcPr>
+          <w:p>
+            <w:r>
+              <w:rPr>
+                <w:b/>
+              </w:rPr>
+              <w:t>Было (11.09)</w:t>
+            </w:r>
+          </w:p>
+        </w:tc>
+        <w:tc>
+          <w:tcPr>
+            <w:tcW w:type="dxa" w:w="1728"/>
+          </w:tcPr>
+          <w:p>
+            <w:r>
+              <w:rPr>
+                <w:b/>
+              </w:rPr>
+              <w:t>Стало (12.09)</w:t>
+            </w:r>
+          </w:p>
+        </w:tc>
+        <w:tc>
+          <w:tcPr>
+            <w:tcW w:type="dxa" w:w="1728"/>
+          </w:tcPr>
+          <w:p>
+            <w:r>
+              <w:rPr>
+                <w:b/>
+              </w:rPr>
+              <w:t>Категория</w:t>
+            </w:r>
+          </w:p>
+        </w:tc>
+      </w:tr>
+      <w:tr>
+        <w:tc>
+          <w:tcPr>
+            <w:tcW w:type="dxa" w:w="1728"/>
+          </w:tcPr>
+          <w:p>
+            <w:r>
+              <w:t>1.1</w:t>
+            </w:r>
+          </w:p>
+        </w:tc>
+        <w:tc>
+          <w:tcPr>
+            <w:tcW w:type="dxa" w:w="1728"/>
+          </w:tcPr>
+          <w:p>
+            <w:r>
+              <w:t>Акт забраковки — действия начальника склада</w:t>
+            </w:r>
+          </w:p>
+        </w:tc>
+        <w:tc>
+          <w:tcPr>
+            <w:tcW w:type="dxa" w:w="1728"/>
+          </w:tcPr>
+          <w:p>
+            <w:r>
+              <w:t>Чёткий ответ</w:t>
+            </w:r>
+          </w:p>
+        </w:tc>
+        <w:tc>
+          <w:tcPr>
+            <w:tcW w:type="dxa" w:w="1728"/>
+          </w:tcPr>
+          <w:p>
+            <w:r>
+              <w:t>Без изменений</w:t>
+            </w:r>
+          </w:p>
+        </w:tc>
+        <w:tc>
+          <w:tcPr>
+            <w:tcW w:type="dxa" w:w="1728"/>
+          </w:tcPr>
+          <w:p>
+            <w:r>
+              <w:t>Без изменений — верно</w:t>
+            </w:r>
+          </w:p>
+        </w:tc>
+      </w:tr>
+      <w:tr>
+        <w:tc>
+          <w:tcPr>
+            <w:tcW w:type="dxa" w:w="1728"/>
+          </w:tcPr>
+          <w:p>
+            <w:r>
+              <w:t>1.2</w:t>
+            </w:r>
+          </w:p>
+        </w:tc>
+        <w:tc>
+          <w:tcPr>
+            <w:tcW w:type="dxa" w:w="1728"/>
+          </w:tcPr>
+          <w:p>
+            <w:r>
+              <w:t>Кто руководит экспериментальной партией</w:t>
+            </w:r>
+          </w:p>
+        </w:tc>
+        <w:tc>
+          <w:tcPr>
+            <w:tcW w:type="dxa" w:w="1728"/>
+          </w:tcPr>
+          <w:p>
+            <w:r>
+              <w:t>Нет чёткого ответа</w:t>
+            </w:r>
+          </w:p>
+        </w:tc>
+        <w:tc>
+          <w:tcPr>
+            <w:tcW w:type="dxa" w:w="1728"/>
+          </w:tcPr>
+          <w:p>
+            <w:r>
+              <w:t>Отвечено верно</w:t>
+            </w:r>
+          </w:p>
+        </w:tc>
+        <w:tc>
+          <w:tcPr>
+            <w:tcW w:type="dxa" w:w="1728"/>
+          </w:tcPr>
+          <w:p>
+            <w:r>
+              <w:t>Исправлено</w:t>
+            </w:r>
+          </w:p>
+        </w:tc>
+      </w:tr>
+      <w:tr>
+        <w:tc>
+          <w:tcPr>
+            <w:tcW w:type="dxa" w:w="1728"/>
+          </w:tcPr>
+          <w:p>
+            <w:r>
+              <w:t>1.3</w:t>
+            </w:r>
+          </w:p>
+        </w:tc>
+        <w:tc>
+          <w:tcPr>
+            <w:tcW w:type="dxa" w:w="1728"/>
+          </w:tcPr>
+          <w:p>
+            <w:r>
+              <w:t>Пометка «Экспериментальная» — действия мастера</w:t>
+            </w:r>
+          </w:p>
+        </w:tc>
+        <w:tc>
+          <w:tcPr>
+            <w:tcW w:type="dxa" w:w="1728"/>
+          </w:tcPr>
+          <w:p>
+            <w:r>
+              <w:t>Частичный ответ</w:t>
+            </w:r>
+          </w:p>
+        </w:tc>
+        <w:tc>
+          <w:tcPr>
+            <w:tcW w:type="dxa" w:w="1728"/>
+          </w:tcPr>
+          <w:p>
+            <w:r>
+              <w:t>Отвечено верно</w:t>
+            </w:r>
+          </w:p>
+        </w:tc>
+        <w:tc>
+          <w:tcPr>
+            <w:tcW w:type="dxa" w:w="1728"/>
+          </w:tcPr>
+          <w:p>
+            <w:r>
+              <w:t>Исправлено</w:t>
+            </w:r>
+          </w:p>
+        </w:tc>
+      </w:tr>
+      <w:tr>
+        <w:tc>
+          <w:tcPr>
+            <w:tcW w:type="dxa" w:w="1728"/>
+          </w:tcPr>
+          <w:p>
+            <w:r>
+              <w:t>2.1</w:t>
+            </w:r>
+          </w:p>
+        </w:tc>
+        <w:tc>
+          <w:tcPr>
+            <w:tcW w:type="dxa" w:w="1728"/>
+          </w:tcPr>
+          <w:p>
+            <w:r>
+              <w:t>Поля после фасовки</w:t>
+            </w:r>
+          </w:p>
+        </w:tc>
+        <w:tc>
+          <w:tcPr>
+            <w:tcW w:type="dxa" w:w="1728"/>
+          </w:tcPr>
+          <w:p>
+            <w:r>
+              <w:t>Чёткий ответ</w:t>
+            </w:r>
+          </w:p>
+        </w:tc>
+        <w:tc>
+          <w:tcPr>
+            <w:tcW w:type="dxa" w:w="1728"/>
+          </w:tcPr>
+          <w:p>
+            <w:r>
+              <w:t>Поля не названы + подозрительный источник</w:t>
+            </w:r>
+          </w:p>
+        </w:tc>
+        <w:tc>
+          <w:tcPr>
+            <w:tcW w:type="dxa" w:w="1728"/>
+          </w:tcPr>
+          <w:p>
+            <w:r>
+              <w:t>Регрессия</w:t>
+            </w:r>
+          </w:p>
+        </w:tc>
+      </w:tr>
+      <w:tr>
+        <w:tc>
+          <w:tcPr>
+            <w:tcW w:type="dxa" w:w="1728"/>
+          </w:tcPr>
+          <w:p>
+            <w:r>
+              <w:t>2.2</w:t>
+            </w:r>
+          </w:p>
+        </w:tc>
+        <w:tc>
+          <w:tcPr>
+            <w:tcW w:type="dxa" w:w="1728"/>
+          </w:tcPr>
+          <w:p>
+            <w:r>
+              <w:t>Корректировка Заказа на производство</w:t>
+            </w:r>
+          </w:p>
+        </w:tc>
+        <w:tc>
+          <w:tcPr>
+            <w:tcW w:type="dxa" w:w="1728"/>
+          </w:tcPr>
+          <w:p>
+            <w:r>
+              <w:t>Частичный ответ</w:t>
+            </w:r>
+          </w:p>
+        </w:tc>
+        <w:tc>
+          <w:tcPr>
+            <w:tcW w:type="dxa" w:w="1728"/>
+          </w:tcPr>
+          <w:p>
+            <w:r>
+              <w:t>Тот же общий ответ</w:t>
+            </w:r>
+          </w:p>
+        </w:tc>
+        <w:tc>
+          <w:tcPr>
+            <w:tcW w:type="dxa" w:w="1728"/>
+          </w:tcPr>
+          <w:p>
+            <w:r>
+              <w:t>Без изменений — ошибка сохраняется</w:t>
+            </w:r>
+          </w:p>
+        </w:tc>
+      </w:tr>
+      <w:tr>
+        <w:tc>
+          <w:tcPr>
+            <w:tcW w:type="dxa" w:w="1728"/>
+          </w:tcPr>
+          <w:p>
+            <w:r>
+              <w:t>2.3</w:t>
+            </w:r>
+          </w:p>
+        </w:tc>
+        <w:tc>
+          <w:tcPr>
+            <w:tcW w:type="dxa" w:w="1728"/>
+          </w:tcPr>
+          <w:p>
+            <w:r>
+              <w:t>Высота сброса тары</w:t>
+            </w:r>
+          </w:p>
+        </w:tc>
+        <w:tc>
+          <w:tcPr>
+            <w:tcW w:type="dxa" w:w="1728"/>
+          </w:tcPr>
+          <w:p>
+            <w:r>
+              <w:t>Нет чёткого ответа</w:t>
+            </w:r>
+          </w:p>
+        </w:tc>
+        <w:tc>
+          <w:tcPr>
+            <w:tcW w:type="dxa" w:w="1728"/>
+          </w:tcPr>
+          <w:p>
+            <w:r>
+              <w:t>Высота по-прежнему не дана + аномалия цитирования</w:t>
+            </w:r>
+          </w:p>
+        </w:tc>
+        <w:tc>
+          <w:tcPr>
+            <w:tcW w:type="dxa" w:w="1728"/>
+          </w:tcPr>
+          <w:p>
+            <w:r>
+              <w:t>Без изменений — ошибка сохраняется</w:t>
+            </w:r>
+          </w:p>
+        </w:tc>
+      </w:tr>
+      <w:tr>
+        <w:tc>
+          <w:tcPr>
+            <w:tcW w:type="dxa" w:w="1728"/>
+          </w:tcPr>
+          <w:p>
+            <w:r>
+              <w:t>3.1</w:t>
+            </w:r>
+          </w:p>
+        </w:tc>
+        <w:tc>
+          <w:tcPr>
+            <w:tcW w:type="dxa" w:w="1728"/>
+          </w:tcPr>
+          <w:p>
+            <w:r>
+              <w:t>Технолог ПО получает сырьё</w:t>
+            </w:r>
+          </w:p>
+        </w:tc>
+        <w:tc>
+          <w:tcPr>
+            <w:tcW w:type="dxa" w:w="1728"/>
+          </w:tcPr>
+          <w:p>
+            <w:r>
+              <w:t>Чёткий ответ</w:t>
+            </w:r>
+          </w:p>
+        </w:tc>
+        <w:tc>
+          <w:tcPr>
+            <w:tcW w:type="dxa" w:w="1728"/>
+          </w:tcPr>
+          <w:p>
+            <w:r>
+              <w:t>Без изменений</w:t>
+            </w:r>
+          </w:p>
+        </w:tc>
+        <w:tc>
+          <w:tcPr>
+            <w:tcW w:type="dxa" w:w="1728"/>
+          </w:tcPr>
+          <w:p>
+            <w:r>
+              <w:t>Без изменений — верно</w:t>
+            </w:r>
+          </w:p>
+        </w:tc>
+      </w:tr>
+      <w:tr>
+        <w:tc>
+          <w:tcPr>
+            <w:tcW w:type="dxa" w:w="1728"/>
+          </w:tcPr>
+          <w:p>
+            <w:r>
+              <w:t>3.2</w:t>
+            </w:r>
+          </w:p>
+        </w:tc>
+        <w:tc>
+          <w:tcPr>
+            <w:tcW w:type="dxa" w:w="1728"/>
+          </w:tcPr>
+          <w:p>
+            <w:r>
+              <w:t>Смена характеристики, заявка распечатана</w:t>
+            </w:r>
+          </w:p>
+        </w:tc>
+        <w:tc>
+          <w:tcPr>
+            <w:tcW w:type="dxa" w:w="1728"/>
+          </w:tcPr>
+          <w:p>
+            <w:r>
+              <w:t>Частичный ответ</w:t>
+            </w:r>
+          </w:p>
+        </w:tc>
+        <w:tc>
+          <w:tcPr>
+            <w:tcW w:type="dxa" w:w="1728"/>
+          </w:tcPr>
+          <w:p>
+            <w:r>
+              <w:t>Источник подключён, деталь всё ещё не дана</w:t>
+            </w:r>
+          </w:p>
+        </w:tc>
+        <w:tc>
+          <w:tcPr>
+            <w:tcW w:type="dxa" w:w="1728"/>
+          </w:tcPr>
+          <w:p>
+            <w:r>
+              <w:t>Частично улучшено</w:t>
+            </w:r>
+          </w:p>
+        </w:tc>
+      </w:tr>
+      <w:tr>
+        <w:tc>
+          <w:tcPr>
+            <w:tcW w:type="dxa" w:w="1728"/>
+          </w:tcPr>
+          <w:p>
+            <w:r>
+              <w:t>3.3</w:t>
+            </w:r>
+          </w:p>
+        </w:tc>
+        <w:tc>
+          <w:tcPr>
+            <w:tcW w:type="dxa" w:w="1728"/>
+          </w:tcPr>
+          <w:p>
+            <w:r>
+              <w:t>Забраковка на производстве</w:t>
+            </w:r>
+          </w:p>
+        </w:tc>
+        <w:tc>
+          <w:tcPr>
+            <w:tcW w:type="dxa" w:w="1728"/>
+          </w:tcPr>
+          <w:p>
+            <w:r>
+              <w:t>Чёткий ответ</w:t>
+            </w:r>
+          </w:p>
+        </w:tc>
+        <w:tc>
+          <w:tcPr>
+            <w:tcW w:type="dxa" w:w="1728"/>
+          </w:tcPr>
+          <w:p>
+            <w:r>
+              <w:t>Без изменений, детальнее</w:t>
+            </w:r>
+          </w:p>
+        </w:tc>
+        <w:tc>
+          <w:tcPr>
+            <w:tcW w:type="dxa" w:w="1728"/>
+          </w:tcPr>
+          <w:p>
+            <w:r>
+              <w:t>Без изменений — верно</w:t>
+            </w:r>
+          </w:p>
+        </w:tc>
+      </w:tr>
+      <w:tr>
+        <w:tc>
+          <w:tcPr>
+            <w:tcW w:type="dxa" w:w="1728"/>
+          </w:tcPr>
+          <w:p>
+            <w:r>
+              <w:t>4.1</w:t>
+            </w:r>
+          </w:p>
+        </w:tc>
+        <w:tc>
+          <w:tcPr>
+            <w:tcW w:type="dxa" w:w="1728"/>
+          </w:tcPr>
+          <w:p>
+            <w:r>
+              <w:t>Марка стретч-плёнки</w:t>
+            </w:r>
+          </w:p>
+        </w:tc>
+        <w:tc>
+          <w:tcPr>
+            <w:tcW w:type="dxa" w:w="1728"/>
+          </w:tcPr>
+          <w:p>
+            <w:r>
+              <w:t>Нет чёткого ответа (верно «не найдено»)</w:t>
+            </w:r>
+          </w:p>
+        </w:tc>
+        <w:tc>
+          <w:tcPr>
+            <w:tcW w:type="dxa" w:w="1728"/>
+          </w:tcPr>
+          <w:p>
+            <w:r>
+              <w:t>Без изменений</w:t>
+            </w:r>
+          </w:p>
+        </w:tc>
+        <w:tc>
+          <w:tcPr>
+            <w:tcW w:type="dxa" w:w="1728"/>
+          </w:tcPr>
+          <w:p>
+            <w:r>
+              <w:t>Без изменений — верно</w:t>
+            </w:r>
+          </w:p>
+        </w:tc>
+      </w:tr>
+      <w:tr>
+        <w:tc>
+          <w:tcPr>
+            <w:tcW w:type="dxa" w:w="1728"/>
+          </w:tcPr>
+          <w:p>
+            <w:r>
+              <w:t>4.2</w:t>
+            </w:r>
+          </w:p>
+        </w:tc>
+        <w:tc>
+          <w:tcPr>
+            <w:tcW w:type="dxa" w:w="1728"/>
+          </w:tcPr>
+          <w:p>
+            <w:r>
+              <w:t>Периодичность оценки подрядчиков</w:t>
+            </w:r>
+          </w:p>
+        </w:tc>
+        <w:tc>
+          <w:tcPr>
+            <w:tcW w:type="dxa" w:w="1728"/>
+          </w:tcPr>
+          <w:p>
+            <w:r>
+              <w:t>Нет чёткого ответа (открытый вопрос)</w:t>
+            </w:r>
+          </w:p>
+        </w:tc>
+        <w:tc>
+          <w:tcPr>
+            <w:tcW w:type="dxa" w:w="1728"/>
+          </w:tcPr>
+          <w:p>
+            <w:r>
+              <w:t>Найдено смежное поле, конкретики всё ещё нет</w:t>
+            </w:r>
+          </w:p>
+        </w:tc>
+        <w:tc>
+          <w:tcPr>
+            <w:tcW w:type="dxa" w:w="1728"/>
+          </w:tcPr>
+          <w:p>
+            <w:r>
+              <w:t>Без изменений — открытый вопрос</w:t>
+            </w:r>
+          </w:p>
+        </w:tc>
+      </w:tr>
+      <w:tr>
+        <w:tc>
+          <w:tcPr>
+            <w:tcW w:type="dxa" w:w="1728"/>
+          </w:tcPr>
+          <w:p>
+            <w:r>
+              <w:t>4.3</w:t>
+            </w:r>
+          </w:p>
+        </w:tc>
+        <w:tc>
+          <w:tcPr>
+            <w:tcW w:type="dxa" w:w="1728"/>
+          </w:tcPr>
+          <w:p>
+            <w:r>
+              <w:t>Поля Формы 17-08</w:t>
+            </w:r>
+          </w:p>
+        </w:tc>
+        <w:tc>
+          <w:tcPr>
+            <w:tcW w:type="dxa" w:w="1728"/>
+          </w:tcPr>
+          <w:p>
+            <w:r>
+              <w:t>Нет чёткого ответа (верно «не найдено»)</w:t>
+            </w:r>
+          </w:p>
+        </w:tc>
+        <w:tc>
+          <w:tcPr>
+            <w:tcW w:type="dxa" w:w="1728"/>
+          </w:tcPr>
+          <w:p>
+            <w:r>
+              <w:t>Без изменений, источник сменился</w:t>
+            </w:r>
+          </w:p>
+        </w:tc>
+        <w:tc>
+          <w:tcPr>
+            <w:tcW w:type="dxa" w:w="1728"/>
+          </w:tcPr>
+          <w:p>
+            <w:r>
+              <w:t>Без изменений — верно</w:t>
+            </w:r>
+          </w:p>
+        </w:tc>
+      </w:tr>
+      <w:tr>
+        <w:tc>
+          <w:tcPr>
+            <w:tcW w:type="dxa" w:w="1728"/>
+          </w:tcPr>
+          <w:p>
+            <w:r>
+              <w:t>5.1</w:t>
+            </w:r>
+          </w:p>
+        </w:tc>
+        <w:tc>
+          <w:tcPr>
+            <w:tcW w:type="dxa" w:w="1728"/>
+          </w:tcPr>
+          <w:p>
+            <w:r>
+              <w:t>Сырьё со склада «Проверка ОКК»</w:t>
+            </w:r>
+          </w:p>
+        </w:tc>
+        <w:tc>
+          <w:tcPr>
+            <w:tcW w:type="dxa" w:w="1728"/>
+          </w:tcPr>
+          <w:p>
+            <w:r>
+              <w:t>Частичный ответ (открытый вопрос)</w:t>
+            </w:r>
+          </w:p>
+        </w:tc>
+        <w:tc>
+          <w:tcPr>
+            <w:tcW w:type="dxa" w:w="1728"/>
+          </w:tcPr>
+          <w:p>
+            <w:r>
+              <w:t>Полный пошаговый ответ</w:t>
+            </w:r>
+          </w:p>
+        </w:tc>
+        <w:tc>
+          <w:tcPr>
+            <w:tcW w:type="dxa" w:w="1728"/>
+          </w:tcPr>
+          <w:p>
+            <w:r>
+              <w:t>Улучшено</w:t>
+            </w:r>
+          </w:p>
+        </w:tc>
+      </w:tr>
+      <w:tr>
+        <w:tc>
+          <w:tcPr>
+            <w:tcW w:type="dxa" w:w="1728"/>
+          </w:tcPr>
+          <w:p>
+            <w:r>
+              <w:t>5.2</w:t>
+            </w:r>
+          </w:p>
+        </w:tc>
+        <w:tc>
+          <w:tcPr>
+            <w:tcW w:type="dxa" w:w="1728"/>
+          </w:tcPr>
+          <w:p>
+            <w:r>
+              <w:t>Приоритет заявок на ремонт</w:t>
+            </w:r>
+          </w:p>
+        </w:tc>
+        <w:tc>
+          <w:tcPr>
+            <w:tcW w:type="dxa" w:w="1728"/>
+          </w:tcPr>
+          <w:p>
+            <w:r>
+              <w:t>Частичный ответ</w:t>
+            </w:r>
+          </w:p>
+        </w:tc>
+        <w:tc>
+          <w:tcPr>
+            <w:tcW w:type="dxa" w:w="1728"/>
+          </w:tcPr>
+          <w:p>
+            <w:r>
+              <w:t>Без изменений — контрольный случай</w:t>
+            </w:r>
+          </w:p>
+        </w:tc>
+        <w:tc>
+          <w:tcPr>
+            <w:tcW w:type="dxa" w:w="1728"/>
+          </w:tcPr>
+          <w:p>
+            <w:r>
+              <w:t>Без изменений — ошибка сохраняется</w:t>
+            </w:r>
+          </w:p>
+        </w:tc>
+      </w:tr>
+      <w:tr>
+        <w:tc>
+          <w:tcPr>
+            <w:tcW w:type="dxa" w:w="1728"/>
+          </w:tcPr>
+          <w:p>
+            <w:r>
+              <w:t>5.3</w:t>
+            </w:r>
+          </w:p>
+        </w:tc>
+        <w:tc>
+          <w:tcPr>
+            <w:tcW w:type="dxa" w:w="1728"/>
+          </w:tcPr>
+          <w:p>
+            <w:r>
+              <w:t>Запас продукции при занятом оборудовании</w:t>
+            </w:r>
+          </w:p>
+        </w:tc>
+        <w:tc>
+          <w:tcPr>
+            <w:tcW w:type="dxa" w:w="1728"/>
+          </w:tcPr>
+          <w:p>
+            <w:r>
+              <w:t>Чёткий ответ</w:t>
+            </w:r>
+          </w:p>
+        </w:tc>
+        <w:tc>
+          <w:tcPr>
+            <w:tcW w:type="dxa" w:w="1728"/>
+          </w:tcPr>
+          <w:p>
+            <w:r>
+              <w:t>Без изменений, детальнее</w:t>
+            </w:r>
+          </w:p>
+        </w:tc>
+        <w:tc>
+          <w:tcPr>
+            <w:tcW w:type="dxa" w:w="1728"/>
+          </w:tcPr>
+          <w:p>
+            <w:r>
+              <w:t>Без изменений — верно</w:t>
+            </w:r>
+          </w:p>
+        </w:tc>
+      </w:tr>
+      <w:tr>
+        <w:tc>
+          <w:tcPr>
+            <w:tcW w:type="dxa" w:w="1728"/>
+          </w:tcPr>
+          <w:p>
+            <w:r>
+              <w:t>6.1</w:t>
+            </w:r>
+          </w:p>
+        </w:tc>
+        <w:tc>
+          <w:tcPr>
+            <w:tcW w:type="dxa" w:w="1728"/>
+          </w:tcPr>
+          <w:p>
+            <w:r>
+              <w:t>Действия оператора по фасовке</w:t>
+            </w:r>
+          </w:p>
+        </w:tc>
+        <w:tc>
+          <w:tcPr>
+            <w:tcW w:type="dxa" w:w="1728"/>
+          </w:tcPr>
+          <w:p>
+            <w:r>
+              <w:t>Чёткий ответ</w:t>
+            </w:r>
+          </w:p>
+        </w:tc>
+        <w:tc>
+          <w:tcPr>
+            <w:tcW w:type="dxa" w:w="1728"/>
+          </w:tcPr>
+          <w:p>
+            <w:r>
+              <w:t>Без изменений, детальнее</w:t>
+            </w:r>
+          </w:p>
+        </w:tc>
+        <w:tc>
+          <w:tcPr>
+            <w:tcW w:type="dxa" w:w="1728"/>
+          </w:tcPr>
+          <w:p>
+            <w:r>
+              <w:t>Без изменений — верно</w:t>
+            </w:r>
+          </w:p>
+        </w:tc>
+      </w:tr>
+      <w:tr>
+        <w:tc>
+          <w:tcPr>
+            <w:tcW w:type="dxa" w:w="1728"/>
+          </w:tcPr>
+          <w:p>
+            <w:r>
+              <w:t>6.2</w:t>
+            </w:r>
+          </w:p>
+        </w:tc>
+        <w:tc>
+          <w:tcPr>
+            <w:tcW w:type="dxa" w:w="1728"/>
+          </w:tcPr>
+          <w:p>
+            <w:r>
+              <w:t>Добавление Спецификации в 1С-8</w:t>
+            </w:r>
+          </w:p>
+        </w:tc>
+        <w:tc>
+          <w:tcPr>
+            <w:tcW w:type="dxa" w:w="1728"/>
+          </w:tcPr>
+          <w:p>
+            <w:r>
+              <w:t>Частичный ответ</w:t>
+            </w:r>
+          </w:p>
+        </w:tc>
+        <w:tc>
+          <w:tcPr>
+            <w:tcW w:type="dxa" w:w="1728"/>
+          </w:tcPr>
+          <w:p>
+            <w:r>
+              <w:t>Служебная ошибка сервиса</w:t>
+            </w:r>
+          </w:p>
+        </w:tc>
+        <w:tc>
+          <w:tcPr>
+            <w:tcW w:type="dxa" w:w="1728"/>
+          </w:tcPr>
+          <w:p>
+            <w:r>
+              <w:t>Не оценивается (служебная ошибка)</w:t>
+            </w:r>
+          </w:p>
+        </w:tc>
+      </w:tr>
+      <w:tr>
+        <w:tc>
+          <w:tcPr>
+            <w:tcW w:type="dxa" w:w="1728"/>
+          </w:tcPr>
+          <w:p>
+            <w:r>
+              <w:t>6.3</w:t>
+            </w:r>
+          </w:p>
+        </w:tc>
+        <w:tc>
+          <w:tcPr>
+            <w:tcW w:type="dxa" w:w="1728"/>
+          </w:tcPr>
+          <w:p>
+            <w:r>
+              <w:t>Входной контроль сырья</w:t>
+            </w:r>
+          </w:p>
+        </w:tc>
+        <w:tc>
+          <w:tcPr>
+            <w:tcW w:type="dxa" w:w="1728"/>
+          </w:tcPr>
+          <w:p>
+            <w:r>
+              <w:t>Чёткий ответ</w:t>
+            </w:r>
+          </w:p>
+        </w:tc>
+        <w:tc>
+          <w:tcPr>
+            <w:tcW w:type="dxa" w:w="1728"/>
+          </w:tcPr>
+          <w:p>
+            <w:r>
+              <w:t>Без изменений, детальнее</w:t>
+            </w:r>
+          </w:p>
+        </w:tc>
+        <w:tc>
+          <w:tcPr>
+            <w:tcW w:type="dxa" w:w="1728"/>
+          </w:tcPr>
+          <w:p>
+            <w:r>
+              <w:t>Без изменений — верно</w:t>
+            </w:r>
+          </w:p>
+        </w:tc>
+      </w:tr>
+    </w:tbl>
     <w:p>
       <w:pPr>
         <w:pStyle w:val="Heading2"/>

</xml_diff>